<commit_message>
feat: update app flow and secure local config templates
</commit_message>
<xml_diff>
--- a/离开北京前的 100 个必做清单.docx
+++ b/离开北京前的 100 个必做清单.docx
@@ -1,30 +1,23 @@
 
 <file path=word/document.xml><?xml version="1.0" encoding="utf-8"?>
-<w:document xmlns:w="http://schemas.openxmlformats.org/wordprocessingml/2006/main">
+<w:document xmlns:wpc="http://schemas.microsoft.com/office/word/2010/wordprocessingCanvas" xmlns:mc="http://schemas.openxmlformats.org/markup-compatibility/2006" xmlns:o="urn:schemas-microsoft-com:office:office" xmlns:r="http://schemas.openxmlformats.org/officeDocument/2006/relationships" xmlns:m="http://schemas.openxmlformats.org/officeDocument/2006/math" xmlns:v="urn:schemas-microsoft-com:vml" xmlns:wp14="http://schemas.microsoft.com/office/word/2010/wordprocessingDrawing" xmlns:wp="http://schemas.openxmlformats.org/drawingml/2006/wordprocessingDrawing" xmlns:w="http://schemas.openxmlformats.org/wordprocessingml/2006/main" xmlns:w14="http://schemas.microsoft.com/office/word/2010/wordml" xmlns:w10="urn:schemas-microsoft-com:office:word" xmlns:w15="http://schemas.microsoft.com/office/word/2012/wordml" xmlns:wpg="http://schemas.microsoft.com/office/word/2010/wordprocessingGroup" xmlns:wpi="http://schemas.microsoft.com/office/word/2010/wordprocessingInk" xmlns:wne="http://schemas.microsoft.com/office/word/2006/wordml" xmlns:wps="http://schemas.microsoft.com/office/word/2010/wordprocessingShape" xmlns:wpsCustomData="http://www.wps.cn/officeDocument/2013/wpsCustomData" mc:Ignorable="w14 w15 wp14">
   <w:body>
     <w:p>
       <w:pPr>
-        <w:pStyle w:val="000013"/>
-        <w:pBdr/>
-        <w:ind/>
-        <w:rPr/>
-      </w:pPr>
-      <w:r>
-        <w:rPr/>
+        <w:pStyle w:val="15"/>
+      </w:pPr>
+      <w:r>
         <w:t>离开北京前的 100 个必做清单</w:t>
       </w:r>
     </w:p>
     <w:p>
       <w:pPr>
-        <w:pStyle w:val="000011"/>
+        <w:pStyle w:val="14"/>
         <w:pBdr>
-          <w:bottom/>
+          <w:bottom w:val="none" w:color="auto" w:sz="0" w:space="0"/>
         </w:pBdr>
-        <w:ind/>
-        <w:rPr/>
-      </w:pPr>
-      <w:r>
-        <w:rPr/>
+      </w:pPr>
+      <w:r>
         <w:t>@格子将</w:t>
       </w:r>
       <w:r>
@@ -34,17 +27,14 @@
         <w:t xml:space="preserve"> 整理出品</w:t>
       </w:r>
       <w:r>
-        <w:rPr/>
         <w:t xml:space="preserve">  </w:t>
       </w:r>
     </w:p>
     <w:p>
       <w:pPr>
-        <w:pStyle w:val="000005"/>
-        <w:rPr/>
-      </w:pPr>
-      <w:r>
-        <w:rPr/>
+        <w:pStyle w:val="5"/>
+      </w:pPr>
+      <w:r>
         <w:t>一、 皇家气象与历史名胜</w:t>
       </w:r>
     </w:p>
@@ -54,18 +44,28 @@
           <w:ilvl w:val="0"/>
           <w:numId w:val="1"/>
         </w:numPr>
-        <w:snapToGrid w:val="1"/>
-        <w:spacing w:before="0" w:after="90" w:line="240"/>
-        <w:rPr/>
-      </w:pPr>
-      <w:r>
-        <w:rPr>
-          <w:i w:val="0"/>
-          <w:strike w:val="0"/>
-          <w:color w:val="000000"/>
-          <w:u w:val="none"/>
-        </w:rPr>
-        <w:t>1. 故宫：挑一个雪天或大雨后，去听红墙外的回声。</w:t>
+        <w:snapToGrid/>
+        <w:spacing w:before="0" w:after="90" w:line="240" w:lineRule="auto"/>
+      </w:pPr>
+      <w:r>
+        <w:rPr>
+          <w:i w:val="0"/>
+          <w:strike w:val="0"/>
+          <w:color w:val="000000"/>
+          <w:u w:val="none"/>
+        </w:rPr>
+        <w:t>1.天安门升旗：熬一次夜，看第一缕阳光下的红旗</w:t>
+      </w:r>
+      <w:r>
+        <w:rPr>
+          <w:rFonts w:hint="eastAsia"/>
+          <w:i w:val="0"/>
+          <w:strike w:val="0"/>
+          <w:color w:val="000000"/>
+          <w:u w:val="none"/>
+          <w:lang w:eastAsia="zh-CN"/>
+        </w:rPr>
+        <w:t>。</w:t>
       </w:r>
     </w:p>
     <w:p>
@@ -74,18 +74,17 @@
           <w:ilvl w:val="0"/>
           <w:numId w:val="1"/>
         </w:numPr>
-        <w:snapToGrid w:val="1"/>
-        <w:spacing w:before="0" w:after="90" w:line="240"/>
-        <w:rPr/>
-      </w:pPr>
-      <w:r>
-        <w:rPr>
-          <w:i w:val="0"/>
-          <w:strike w:val="0"/>
-          <w:color w:val="000000"/>
-          <w:u w:val="none"/>
-        </w:rPr>
-        <w:t>2. 天安门升旗：熬一次夜，看第一缕阳光下的红旗。</w:t>
+        <w:snapToGrid/>
+        <w:spacing w:before="0" w:after="90" w:line="240" w:lineRule="auto"/>
+      </w:pPr>
+      <w:r>
+        <w:rPr>
+          <w:i w:val="0"/>
+          <w:strike w:val="0"/>
+          <w:color w:val="000000"/>
+          <w:u w:val="none"/>
+        </w:rPr>
+        <w:t>2.故宫：挑一个雪天或大雨后，去听红墙外的回声。</w:t>
       </w:r>
     </w:p>
     <w:p>
@@ -94,18 +93,17 @@
           <w:ilvl w:val="0"/>
           <w:numId w:val="1"/>
         </w:numPr>
-        <w:snapToGrid w:val="1"/>
-        <w:spacing w:before="0" w:after="90" w:line="240"/>
-        <w:rPr/>
-      </w:pPr>
-      <w:r>
-        <w:rPr>
-          <w:i w:val="0"/>
-          <w:strike w:val="0"/>
-          <w:color w:val="000000"/>
-          <w:u w:val="none"/>
-        </w:rPr>
-        <w:t>3. 天坛公园：在回音壁旁闭眼听，感受明清建筑的声学奇迹。</w:t>
+        <w:snapToGrid/>
+        <w:spacing w:before="0" w:after="90" w:line="240" w:lineRule="auto"/>
+      </w:pPr>
+      <w:r>
+        <w:rPr>
+          <w:i w:val="0"/>
+          <w:strike w:val="0"/>
+          <w:color w:val="000000"/>
+          <w:u w:val="none"/>
+        </w:rPr>
+        <w:t>3.天坛公园：在回音壁旁闭眼听，感受明清建筑的声学奇迹。</w:t>
       </w:r>
     </w:p>
     <w:p>
@@ -114,9 +112,8 @@
           <w:ilvl w:val="0"/>
           <w:numId w:val="1"/>
         </w:numPr>
-        <w:snapToGrid w:val="1"/>
-        <w:spacing w:before="0" w:after="90" w:line="240"/>
-        <w:rPr/>
+        <w:snapToGrid/>
+        <w:spacing w:before="0" w:after="90" w:line="240" w:lineRule="auto"/>
       </w:pPr>
       <w:r>
         <w:rPr>
@@ -134,9 +131,8 @@
           <w:ilvl w:val="0"/>
           <w:numId w:val="1"/>
         </w:numPr>
-        <w:snapToGrid w:val="1"/>
-        <w:spacing w:before="0" w:after="90" w:line="240"/>
-        <w:rPr/>
+        <w:snapToGrid/>
+        <w:spacing w:before="0" w:after="90" w:line="240" w:lineRule="auto"/>
       </w:pPr>
       <w:r>
         <w:rPr>
@@ -147,6 +143,8 @@
         </w:rPr>
         <w:t>5. 圆明园：在大水法废墟前静坐，读一段那段厚重的历史。</w:t>
       </w:r>
+      <w:bookmarkStart w:id="0" w:name="_GoBack"/>
+      <w:bookmarkEnd w:id="0"/>
     </w:p>
     <w:p>
       <w:pPr>
@@ -154,9 +152,8 @@
           <w:ilvl w:val="0"/>
           <w:numId w:val="1"/>
         </w:numPr>
-        <w:snapToGrid w:val="1"/>
-        <w:spacing w:before="0" w:after="90" w:line="240"/>
-        <w:rPr/>
+        <w:snapToGrid/>
+        <w:spacing w:before="0" w:after="90" w:line="240" w:lineRule="auto"/>
       </w:pPr>
       <w:r>
         <w:rPr>
@@ -174,9 +171,8 @@
           <w:ilvl w:val="0"/>
           <w:numId w:val="1"/>
         </w:numPr>
-        <w:snapToGrid w:val="1"/>
-        <w:spacing w:before="0" w:after="90" w:line="240"/>
-        <w:rPr/>
+        <w:snapToGrid/>
+        <w:spacing w:before="0" w:after="90" w:line="240" w:lineRule="auto"/>
       </w:pPr>
       <w:r>
         <w:rPr>
@@ -194,9 +190,8 @@
           <w:ilvl w:val="0"/>
           <w:numId w:val="1"/>
         </w:numPr>
-        <w:snapToGrid w:val="1"/>
-        <w:spacing w:before="0" w:after="90" w:line="240"/>
-        <w:rPr/>
+        <w:snapToGrid/>
+        <w:spacing w:before="0" w:after="90" w:line="240" w:lineRule="auto"/>
       </w:pPr>
       <w:r>
         <w:rPr>
@@ -214,9 +209,8 @@
           <w:ilvl w:val="0"/>
           <w:numId w:val="1"/>
         </w:numPr>
-        <w:snapToGrid w:val="1"/>
-        <w:spacing w:before="0" w:after="90" w:line="240"/>
-        <w:rPr/>
+        <w:snapToGrid/>
+        <w:spacing w:before="0" w:after="90" w:line="240" w:lineRule="auto"/>
       </w:pPr>
       <w:r>
         <w:rPr>
@@ -234,9 +228,8 @@
           <w:ilvl w:val="0"/>
           <w:numId w:val="1"/>
         </w:numPr>
-        <w:snapToGrid w:val="1"/>
-        <w:spacing w:before="0" w:after="90" w:line="240"/>
-        <w:rPr/>
+        <w:snapToGrid/>
+        <w:spacing w:before="0" w:after="90" w:line="240" w:lineRule="auto"/>
       </w:pPr>
       <w:r>
         <w:rPr>
@@ -254,9 +247,8 @@
           <w:ilvl w:val="0"/>
           <w:numId w:val="1"/>
         </w:numPr>
-        <w:snapToGrid w:val="1"/>
-        <w:spacing w:before="0" w:after="90" w:line="240"/>
-        <w:rPr/>
+        <w:snapToGrid/>
+        <w:spacing w:before="0" w:after="90" w:line="240" w:lineRule="auto"/>
       </w:pPr>
       <w:r>
         <w:rPr>
@@ -274,9 +266,8 @@
           <w:ilvl w:val="0"/>
           <w:numId w:val="1"/>
         </w:numPr>
-        <w:snapToGrid w:val="1"/>
-        <w:spacing w:before="0" w:after="90" w:line="240"/>
-        <w:rPr/>
+        <w:snapToGrid/>
+        <w:spacing w:before="0" w:after="90" w:line="240" w:lineRule="auto"/>
       </w:pPr>
       <w:r>
         <w:rPr>
@@ -294,9 +285,8 @@
           <w:ilvl w:val="0"/>
           <w:numId w:val="1"/>
         </w:numPr>
-        <w:snapToGrid w:val="1"/>
-        <w:spacing w:before="0" w:after="90" w:line="240"/>
-        <w:rPr/>
+        <w:snapToGrid/>
+        <w:spacing w:before="0" w:after="90" w:line="240" w:lineRule="auto"/>
       </w:pPr>
       <w:r>
         <w:rPr>
@@ -314,9 +304,8 @@
           <w:ilvl w:val="0"/>
           <w:numId w:val="1"/>
         </w:numPr>
-        <w:snapToGrid w:val="1"/>
-        <w:spacing w:before="0" w:after="90" w:line="240"/>
-        <w:rPr/>
+        <w:snapToGrid/>
+        <w:spacing w:before="0" w:after="90" w:line="240" w:lineRule="auto"/>
       </w:pPr>
       <w:r>
         <w:rPr>
@@ -334,9 +323,8 @@
           <w:ilvl w:val="0"/>
           <w:numId w:val="1"/>
         </w:numPr>
-        <w:snapToGrid w:val="1"/>
-        <w:spacing w:before="0" w:after="90" w:line="240"/>
-        <w:rPr/>
+        <w:snapToGrid/>
+        <w:spacing w:before="0" w:after="90" w:line="240" w:lineRule="auto"/>
       </w:pPr>
       <w:r>
         <w:rPr>
@@ -354,9 +342,8 @@
           <w:ilvl w:val="0"/>
           <w:numId w:val="1"/>
         </w:numPr>
-        <w:snapToGrid w:val="1"/>
-        <w:spacing w:before="0" w:after="90" w:line="240"/>
-        <w:rPr/>
+        <w:snapToGrid/>
+        <w:spacing w:before="0" w:after="90" w:line="240" w:lineRule="auto"/>
       </w:pPr>
       <w:r>
         <w:rPr>
@@ -374,9 +361,8 @@
           <w:ilvl w:val="0"/>
           <w:numId w:val="1"/>
         </w:numPr>
-        <w:snapToGrid w:val="1"/>
-        <w:spacing w:before="0" w:after="90" w:line="240"/>
-        <w:rPr/>
+        <w:snapToGrid/>
+        <w:spacing w:before="0" w:after="90" w:line="240" w:lineRule="auto"/>
       </w:pPr>
       <w:r>
         <w:rPr>
@@ -409,19 +395,16 @@
     </w:p>
     <w:p>
       <w:pPr>
-        <w:snapToGrid w:val="1"/>
-        <w:spacing w:before="0" w:after="90" w:line="240"/>
+        <w:snapToGrid/>
+        <w:spacing w:before="0" w:after="90" w:line="240" w:lineRule="auto"/>
         <w:ind w:left="0" w:right="0"/>
-        <w:rPr/>
-      </w:pPr>
-    </w:p>
-    <w:p>
-      <w:pPr>
-        <w:pStyle w:val="000005"/>
-        <w:rPr/>
-      </w:pPr>
-      <w:r>
-        <w:rPr/>
+      </w:pPr>
+    </w:p>
+    <w:p>
+      <w:pPr>
+        <w:pStyle w:val="5"/>
+      </w:pPr>
+      <w:r>
         <w:t>二、 博古论今：博物馆与艺术</w:t>
       </w:r>
     </w:p>
@@ -431,9 +414,8 @@
           <w:ilvl w:val="0"/>
           <w:numId w:val="2"/>
         </w:numPr>
-        <w:snapToGrid w:val="1"/>
-        <w:spacing w:before="0" w:after="90" w:line="240"/>
-        <w:rPr/>
+        <w:snapToGrid/>
+        <w:spacing w:before="0" w:after="90" w:line="240" w:lineRule="auto"/>
       </w:pPr>
       <w:r>
         <w:rPr>
@@ -451,9 +433,8 @@
           <w:ilvl w:val="0"/>
           <w:numId w:val="2"/>
         </w:numPr>
-        <w:snapToGrid w:val="1"/>
-        <w:spacing w:before="0" w:after="90" w:line="240"/>
-        <w:rPr/>
+        <w:snapToGrid/>
+        <w:spacing w:before="0" w:after="90" w:line="240" w:lineRule="auto"/>
       </w:pPr>
       <w:r>
         <w:rPr>
@@ -471,9 +452,8 @@
           <w:ilvl w:val="0"/>
           <w:numId w:val="2"/>
         </w:numPr>
-        <w:snapToGrid w:val="1"/>
-        <w:spacing w:before="0" w:after="90" w:line="240"/>
-        <w:rPr/>
+        <w:snapToGrid/>
+        <w:spacing w:before="0" w:after="90" w:line="240" w:lineRule="auto"/>
       </w:pPr>
       <w:r>
         <w:rPr>
@@ -491,9 +471,8 @@
           <w:ilvl w:val="0"/>
           <w:numId w:val="2"/>
         </w:numPr>
-        <w:snapToGrid w:val="1"/>
-        <w:spacing w:before="0" w:after="90" w:line="240"/>
-        <w:rPr/>
+        <w:snapToGrid/>
+        <w:spacing w:before="0" w:after="90" w:line="240" w:lineRule="auto"/>
       </w:pPr>
       <w:r>
         <w:rPr>
@@ -511,9 +490,8 @@
           <w:ilvl w:val="0"/>
           <w:numId w:val="2"/>
         </w:numPr>
-        <w:snapToGrid w:val="1"/>
-        <w:spacing w:before="0" w:after="90" w:line="240"/>
-        <w:rPr/>
+        <w:snapToGrid/>
+        <w:spacing w:before="0" w:after="90" w:line="240" w:lineRule="auto"/>
       </w:pPr>
       <w:r>
         <w:rPr>
@@ -531,9 +509,8 @@
           <w:ilvl w:val="0"/>
           <w:numId w:val="2"/>
         </w:numPr>
-        <w:snapToGrid w:val="1"/>
-        <w:spacing w:before="0" w:after="90" w:line="240"/>
-        <w:rPr/>
+        <w:snapToGrid/>
+        <w:spacing w:before="0" w:after="90" w:line="240" w:lineRule="auto"/>
       </w:pPr>
       <w:r>
         <w:rPr>
@@ -551,9 +528,8 @@
           <w:ilvl w:val="0"/>
           <w:numId w:val="2"/>
         </w:numPr>
-        <w:snapToGrid w:val="1"/>
-        <w:spacing w:before="0" w:after="90" w:line="240"/>
-        <w:rPr/>
+        <w:snapToGrid/>
+        <w:spacing w:before="0" w:after="90" w:line="240" w:lineRule="auto"/>
       </w:pPr>
       <w:r>
         <w:rPr>
@@ -571,9 +547,8 @@
           <w:ilvl w:val="0"/>
           <w:numId w:val="2"/>
         </w:numPr>
-        <w:snapToGrid w:val="1"/>
-        <w:spacing w:before="0" w:after="90" w:line="240"/>
-        <w:rPr/>
+        <w:snapToGrid/>
+        <w:spacing w:before="0" w:after="90" w:line="240" w:lineRule="auto"/>
       </w:pPr>
       <w:r>
         <w:rPr>
@@ -591,9 +566,8 @@
           <w:ilvl w:val="0"/>
           <w:numId w:val="2"/>
         </w:numPr>
-        <w:snapToGrid w:val="1"/>
-        <w:spacing w:before="0" w:after="90" w:line="240"/>
-        <w:rPr/>
+        <w:snapToGrid/>
+        <w:spacing w:before="0" w:after="90" w:line="240" w:lineRule="auto"/>
       </w:pPr>
       <w:r>
         <w:rPr>
@@ -611,9 +585,8 @@
           <w:ilvl w:val="0"/>
           <w:numId w:val="2"/>
         </w:numPr>
-        <w:snapToGrid w:val="1"/>
-        <w:spacing w:before="0" w:after="90" w:line="240"/>
-        <w:rPr/>
+        <w:snapToGrid/>
+        <w:spacing w:before="0" w:after="90" w:line="240" w:lineRule="auto"/>
       </w:pPr>
       <w:r>
         <w:rPr>
@@ -631,9 +604,8 @@
           <w:ilvl w:val="0"/>
           <w:numId w:val="2"/>
         </w:numPr>
-        <w:snapToGrid w:val="1"/>
-        <w:spacing w:before="0" w:after="90" w:line="240"/>
-        <w:rPr/>
+        <w:snapToGrid/>
+        <w:spacing w:before="0" w:after="90" w:line="240" w:lineRule="auto"/>
       </w:pPr>
       <w:r>
         <w:rPr>
@@ -651,9 +623,8 @@
           <w:ilvl w:val="0"/>
           <w:numId w:val="2"/>
         </w:numPr>
-        <w:snapToGrid w:val="1"/>
-        <w:spacing w:before="0" w:after="90" w:line="240"/>
-        <w:rPr/>
+        <w:snapToGrid/>
+        <w:spacing w:before="0" w:after="90" w:line="240" w:lineRule="auto"/>
       </w:pPr>
       <w:r>
         <w:rPr>
@@ -671,9 +642,8 @@
           <w:ilvl w:val="0"/>
           <w:numId w:val="2"/>
         </w:numPr>
-        <w:snapToGrid w:val="1"/>
-        <w:spacing w:before="0" w:after="90" w:line="240"/>
-        <w:rPr/>
+        <w:snapToGrid/>
+        <w:spacing w:before="0" w:after="90" w:line="240" w:lineRule="auto"/>
       </w:pPr>
       <w:r>
         <w:rPr>
@@ -691,9 +661,8 @@
           <w:ilvl w:val="0"/>
           <w:numId w:val="2"/>
         </w:numPr>
-        <w:snapToGrid w:val="1"/>
-        <w:spacing w:before="0" w:after="90" w:line="240"/>
-        <w:rPr/>
+        <w:snapToGrid/>
+        <w:spacing w:before="0" w:after="90" w:line="240" w:lineRule="auto"/>
       </w:pPr>
       <w:r>
         <w:rPr>
@@ -711,9 +680,8 @@
           <w:ilvl w:val="0"/>
           <w:numId w:val="2"/>
         </w:numPr>
-        <w:snapToGrid w:val="1"/>
-        <w:spacing w:before="0" w:after="90" w:line="240"/>
-        <w:rPr/>
+        <w:snapToGrid/>
+        <w:spacing w:before="0" w:after="90" w:line="240" w:lineRule="auto"/>
       </w:pPr>
       <w:r>
         <w:rPr>
@@ -731,9 +699,8 @@
           <w:ilvl w:val="0"/>
           <w:numId w:val="2"/>
         </w:numPr>
-        <w:snapToGrid w:val="1"/>
-        <w:spacing w:before="0" w:after="90" w:line="240"/>
-        <w:rPr/>
+        <w:snapToGrid/>
+        <w:spacing w:before="0" w:after="90" w:line="240" w:lineRule="auto"/>
       </w:pPr>
       <w:r>
         <w:rPr>
@@ -751,9 +718,8 @@
           <w:ilvl w:val="0"/>
           <w:numId w:val="2"/>
         </w:numPr>
-        <w:snapToGrid w:val="1"/>
-        <w:spacing w:before="0" w:after="90" w:line="240"/>
-        <w:rPr/>
+        <w:snapToGrid/>
+        <w:spacing w:before="0" w:after="90" w:line="240" w:lineRule="auto"/>
       </w:pPr>
       <w:r>
         <w:rPr>
@@ -771,9 +737,8 @@
           <w:ilvl w:val="0"/>
           <w:numId w:val="2"/>
         </w:numPr>
-        <w:snapToGrid w:val="1"/>
-        <w:spacing w:before="0" w:after="90" w:line="240"/>
-        <w:rPr/>
+        <w:snapToGrid/>
+        <w:spacing w:before="0" w:after="90" w:line="240" w:lineRule="auto"/>
       </w:pPr>
       <w:r>
         <w:rPr>
@@ -791,9 +756,8 @@
           <w:ilvl w:val="0"/>
           <w:numId w:val="2"/>
         </w:numPr>
-        <w:snapToGrid w:val="1"/>
-        <w:spacing w:before="0" w:after="90" w:line="240"/>
-        <w:rPr/>
+        <w:snapToGrid/>
+        <w:spacing w:before="0" w:after="90" w:line="240" w:lineRule="auto"/>
       </w:pPr>
       <w:r>
         <w:rPr>
@@ -811,9 +775,8 @@
           <w:ilvl w:val="0"/>
           <w:numId w:val="2"/>
         </w:numPr>
-        <w:snapToGrid w:val="1"/>
-        <w:spacing w:before="0" w:after="90" w:line="240"/>
-        <w:rPr/>
+        <w:snapToGrid/>
+        <w:spacing w:before="0" w:after="90" w:line="240" w:lineRule="auto"/>
       </w:pPr>
       <w:r>
         <w:rPr>
@@ -831,9 +794,8 @@
           <w:ilvl w:val="0"/>
           <w:numId w:val="2"/>
         </w:numPr>
-        <w:snapToGrid w:val="1"/>
-        <w:spacing w:before="0" w:after="90" w:line="240"/>
-        <w:rPr/>
+        <w:snapToGrid/>
+        <w:spacing w:before="0" w:after="90" w:line="240" w:lineRule="auto"/>
       </w:pPr>
       <w:r>
         <w:rPr>
@@ -851,9 +813,8 @@
           <w:ilvl w:val="0"/>
           <w:numId w:val="2"/>
         </w:numPr>
-        <w:snapToGrid w:val="1"/>
-        <w:spacing w:before="0" w:after="90" w:line="240"/>
-        <w:rPr/>
+        <w:snapToGrid/>
+        <w:spacing w:before="0" w:after="90" w:line="240" w:lineRule="auto"/>
       </w:pPr>
       <w:r>
         <w:rPr>
@@ -871,9 +832,8 @@
           <w:ilvl w:val="0"/>
           <w:numId w:val="2"/>
         </w:numPr>
-        <w:snapToGrid w:val="1"/>
-        <w:spacing w:before="0" w:after="90" w:line="240"/>
-        <w:rPr/>
+        <w:snapToGrid/>
+        <w:spacing w:before="0" w:after="90" w:line="240" w:lineRule="auto"/>
       </w:pPr>
       <w:r>
         <w:rPr>
@@ -891,9 +851,8 @@
           <w:ilvl w:val="0"/>
           <w:numId w:val="2"/>
         </w:numPr>
-        <w:snapToGrid w:val="1"/>
-        <w:spacing w:before="0" w:after="90" w:line="240"/>
-        <w:rPr/>
+        <w:snapToGrid/>
+        <w:spacing w:before="0" w:after="90" w:line="240" w:lineRule="auto"/>
       </w:pPr>
       <w:r>
         <w:rPr>
@@ -911,9 +870,8 @@
           <w:ilvl w:val="0"/>
           <w:numId w:val="2"/>
         </w:numPr>
-        <w:snapToGrid w:val="1"/>
-        <w:spacing w:before="0" w:after="90" w:line="240"/>
-        <w:rPr/>
+        <w:snapToGrid/>
+        <w:spacing w:before="0" w:after="90" w:line="240" w:lineRule="auto"/>
       </w:pPr>
       <w:r>
         <w:rPr>
@@ -931,9 +889,8 @@
           <w:ilvl w:val="0"/>
           <w:numId w:val="2"/>
         </w:numPr>
-        <w:snapToGrid w:val="1"/>
-        <w:spacing w:before="0" w:after="90" w:line="240"/>
-        <w:rPr/>
+        <w:snapToGrid/>
+        <w:spacing w:before="0" w:after="90" w:line="240" w:lineRule="auto"/>
       </w:pPr>
       <w:r>
         <w:rPr>
@@ -951,9 +908,8 @@
           <w:ilvl w:val="0"/>
           <w:numId w:val="2"/>
         </w:numPr>
-        <w:snapToGrid w:val="1"/>
-        <w:spacing w:before="0" w:after="90" w:line="240"/>
-        <w:rPr/>
+        <w:snapToGrid/>
+        <w:spacing w:before="0" w:after="90" w:line="240" w:lineRule="auto"/>
       </w:pPr>
       <w:r>
         <w:rPr>
@@ -971,9 +927,8 @@
           <w:ilvl w:val="0"/>
           <w:numId w:val="2"/>
         </w:numPr>
-        <w:snapToGrid w:val="1"/>
-        <w:spacing w:before="0" w:after="90" w:line="240"/>
-        <w:rPr/>
+        <w:snapToGrid/>
+        <w:spacing w:before="0" w:after="90" w:line="240" w:lineRule="auto"/>
       </w:pPr>
       <w:r>
         <w:rPr>
@@ -991,9 +946,8 @@
           <w:ilvl w:val="0"/>
           <w:numId w:val="2"/>
         </w:numPr>
-        <w:snapToGrid w:val="1"/>
-        <w:spacing w:before="0" w:after="90" w:line="240"/>
-        <w:rPr/>
+        <w:snapToGrid/>
+        <w:spacing w:before="0" w:after="90" w:line="240" w:lineRule="auto"/>
       </w:pPr>
       <w:r>
         <w:rPr>
@@ -1011,9 +965,8 @@
           <w:ilvl w:val="0"/>
           <w:numId w:val="2"/>
         </w:numPr>
-        <w:snapToGrid w:val="1"/>
-        <w:spacing w:before="0" w:after="90" w:line="240"/>
-        <w:rPr/>
+        <w:snapToGrid/>
+        <w:spacing w:before="0" w:after="90" w:line="240" w:lineRule="auto"/>
       </w:pPr>
       <w:r>
         <w:rPr>
@@ -1031,9 +984,8 @@
           <w:ilvl w:val="0"/>
           <w:numId w:val="2"/>
         </w:numPr>
-        <w:snapToGrid w:val="1"/>
-        <w:spacing w:before="0" w:after="90" w:line="240"/>
-        <w:ind/>
+        <w:snapToGrid/>
+        <w:spacing w:before="0" w:after="90" w:line="240" w:lineRule="auto"/>
         <w:rPr>
           <w:i w:val="0"/>
           <w:strike w:val="0"/>
@@ -1057,9 +1009,8 @@
           <w:ilvl w:val="0"/>
           <w:numId w:val="2"/>
         </w:numPr>
-        <w:snapToGrid w:val="1"/>
-        <w:spacing w:before="0" w:after="90" w:line="240"/>
-        <w:ind/>
+        <w:snapToGrid/>
+        <w:spacing w:before="0" w:after="90" w:line="240" w:lineRule="auto"/>
         <w:rPr>
           <w:i w:val="0"/>
           <w:strike w:val="0"/>
@@ -1093,9 +1044,8 @@
           <w:ilvl w:val="0"/>
           <w:numId w:val="2"/>
         </w:numPr>
-        <w:snapToGrid w:val="1"/>
-        <w:spacing w:before="0" w:after="90" w:line="240"/>
-        <w:ind/>
+        <w:snapToGrid/>
+        <w:spacing w:before="0" w:after="90" w:line="240" w:lineRule="auto"/>
         <w:rPr>
           <w:i w:val="0"/>
           <w:strike w:val="0"/>
@@ -1144,11 +1094,9 @@
     </w:p>
     <w:p>
       <w:pPr>
-        <w:pStyle w:val="000005"/>
-        <w:rPr/>
-      </w:pPr>
-      <w:r>
-        <w:rPr/>
+        <w:pStyle w:val="5"/>
+      </w:pPr>
+      <w:r>
         <w:t>三、 绿意盎然：公园、自然与远方</w:t>
       </w:r>
     </w:p>
@@ -1158,9 +1106,8 @@
           <w:ilvl w:val="0"/>
           <w:numId w:val="3"/>
         </w:numPr>
-        <w:snapToGrid w:val="1"/>
-        <w:spacing w:before="0" w:after="90" w:line="240"/>
-        <w:rPr/>
+        <w:snapToGrid/>
+        <w:spacing w:before="0" w:after="90" w:line="240" w:lineRule="auto"/>
       </w:pPr>
       <w:r>
         <w:rPr>
@@ -1178,9 +1125,8 @@
           <w:ilvl w:val="0"/>
           <w:numId w:val="3"/>
         </w:numPr>
-        <w:snapToGrid w:val="1"/>
-        <w:spacing w:before="0" w:after="90" w:line="240"/>
-        <w:rPr/>
+        <w:snapToGrid/>
+        <w:spacing w:before="0" w:after="90" w:line="240" w:lineRule="auto"/>
       </w:pPr>
       <w:r>
         <w:rPr>
@@ -1198,9 +1144,8 @@
           <w:ilvl w:val="0"/>
           <w:numId w:val="3"/>
         </w:numPr>
-        <w:snapToGrid w:val="1"/>
-        <w:spacing w:before="0" w:after="90" w:line="240"/>
-        <w:rPr/>
+        <w:snapToGrid/>
+        <w:spacing w:before="0" w:after="90" w:line="240" w:lineRule="auto"/>
       </w:pPr>
       <w:r>
         <w:rPr>
@@ -1218,9 +1163,8 @@
           <w:ilvl w:val="0"/>
           <w:numId w:val="3"/>
         </w:numPr>
-        <w:snapToGrid w:val="1"/>
-        <w:spacing w:before="0" w:after="90" w:line="240"/>
-        <w:rPr/>
+        <w:snapToGrid/>
+        <w:spacing w:before="0" w:after="90" w:line="240" w:lineRule="auto"/>
       </w:pPr>
       <w:r>
         <w:rPr>
@@ -1238,9 +1182,8 @@
           <w:ilvl w:val="0"/>
           <w:numId w:val="3"/>
         </w:numPr>
-        <w:snapToGrid w:val="1"/>
-        <w:spacing w:before="0" w:after="90" w:line="240"/>
-        <w:rPr/>
+        <w:snapToGrid/>
+        <w:spacing w:before="0" w:after="90" w:line="240" w:lineRule="auto"/>
       </w:pPr>
       <w:r>
         <w:rPr>
@@ -1258,9 +1201,8 @@
           <w:ilvl w:val="0"/>
           <w:numId w:val="3"/>
         </w:numPr>
-        <w:snapToGrid w:val="1"/>
-        <w:spacing w:before="0" w:after="90" w:line="240"/>
-        <w:rPr/>
+        <w:snapToGrid/>
+        <w:spacing w:before="0" w:after="90" w:line="240" w:lineRule="auto"/>
       </w:pPr>
       <w:r>
         <w:rPr>
@@ -1278,9 +1220,8 @@
           <w:ilvl w:val="0"/>
           <w:numId w:val="3"/>
         </w:numPr>
-        <w:snapToGrid w:val="1"/>
-        <w:spacing w:before="0" w:after="90" w:line="240"/>
-        <w:rPr/>
+        <w:snapToGrid/>
+        <w:spacing w:before="0" w:after="90" w:line="240" w:lineRule="auto"/>
       </w:pPr>
       <w:r>
         <w:rPr>
@@ -1298,9 +1239,8 @@
           <w:ilvl w:val="0"/>
           <w:numId w:val="3"/>
         </w:numPr>
-        <w:snapToGrid w:val="1"/>
-        <w:spacing w:before="0" w:after="90" w:line="240"/>
-        <w:rPr/>
+        <w:snapToGrid/>
+        <w:spacing w:before="0" w:after="90" w:line="240" w:lineRule="auto"/>
       </w:pPr>
       <w:r>
         <w:rPr>
@@ -1318,9 +1258,8 @@
           <w:ilvl w:val="0"/>
           <w:numId w:val="3"/>
         </w:numPr>
-        <w:snapToGrid w:val="1"/>
-        <w:spacing w:before="0" w:after="90" w:line="240"/>
-        <w:rPr/>
+        <w:snapToGrid/>
+        <w:spacing w:before="0" w:after="90" w:line="240" w:lineRule="auto"/>
       </w:pPr>
       <w:r>
         <w:rPr>
@@ -1338,9 +1277,8 @@
           <w:ilvl w:val="0"/>
           <w:numId w:val="3"/>
         </w:numPr>
-        <w:snapToGrid w:val="1"/>
-        <w:spacing w:before="0" w:after="90" w:line="240"/>
-        <w:rPr/>
+        <w:snapToGrid/>
+        <w:spacing w:before="0" w:after="90" w:line="240" w:lineRule="auto"/>
       </w:pPr>
       <w:r>
         <w:rPr>
@@ -1358,9 +1296,8 @@
           <w:ilvl w:val="0"/>
           <w:numId w:val="3"/>
         </w:numPr>
-        <w:snapToGrid w:val="1"/>
-        <w:spacing w:before="0" w:after="90" w:line="240"/>
-        <w:rPr/>
+        <w:snapToGrid/>
+        <w:spacing w:before="0" w:after="90" w:line="240" w:lineRule="auto"/>
       </w:pPr>
       <w:r>
         <w:rPr>
@@ -1378,9 +1315,8 @@
           <w:ilvl w:val="0"/>
           <w:numId w:val="3"/>
         </w:numPr>
-        <w:snapToGrid w:val="1"/>
-        <w:spacing w:before="0" w:after="90" w:line="240"/>
-        <w:rPr/>
+        <w:snapToGrid/>
+        <w:spacing w:before="0" w:after="90" w:line="240" w:lineRule="auto"/>
       </w:pPr>
       <w:r>
         <w:rPr>
@@ -1398,9 +1334,8 @@
           <w:ilvl w:val="0"/>
           <w:numId w:val="3"/>
         </w:numPr>
-        <w:snapToGrid w:val="1"/>
-        <w:spacing w:before="0" w:after="90" w:line="240"/>
-        <w:rPr/>
+        <w:snapToGrid/>
+        <w:spacing w:before="0" w:after="90" w:line="240" w:lineRule="auto"/>
       </w:pPr>
       <w:r>
         <w:rPr>
@@ -1418,9 +1353,8 @@
           <w:ilvl w:val="0"/>
           <w:numId w:val="3"/>
         </w:numPr>
-        <w:snapToGrid w:val="1"/>
-        <w:spacing w:before="0" w:after="90" w:line="240"/>
-        <w:rPr/>
+        <w:snapToGrid/>
+        <w:spacing w:before="0" w:after="90" w:line="240" w:lineRule="auto"/>
       </w:pPr>
       <w:r>
         <w:rPr>
@@ -1438,9 +1372,8 @@
           <w:ilvl w:val="0"/>
           <w:numId w:val="3"/>
         </w:numPr>
-        <w:snapToGrid w:val="1"/>
-        <w:spacing w:before="0" w:after="90" w:line="240"/>
-        <w:rPr/>
+        <w:snapToGrid/>
+        <w:spacing w:before="0" w:after="90" w:line="240" w:lineRule="auto"/>
       </w:pPr>
       <w:r>
         <w:rPr>
@@ -1458,9 +1391,8 @@
           <w:ilvl w:val="0"/>
           <w:numId w:val="3"/>
         </w:numPr>
-        <w:snapToGrid w:val="1"/>
-        <w:spacing w:before="0" w:after="90" w:line="240"/>
-        <w:rPr/>
+        <w:snapToGrid/>
+        <w:spacing w:before="0" w:after="90" w:line="240" w:lineRule="auto"/>
       </w:pPr>
       <w:r>
         <w:rPr>
@@ -1478,9 +1410,8 @@
           <w:ilvl w:val="0"/>
           <w:numId w:val="3"/>
         </w:numPr>
-        <w:snapToGrid w:val="1"/>
-        <w:spacing w:before="0" w:after="90" w:line="240"/>
-        <w:rPr/>
+        <w:snapToGrid/>
+        <w:spacing w:before="0" w:after="90" w:line="240" w:lineRule="auto"/>
       </w:pPr>
       <w:r>
         <w:rPr>
@@ -1498,9 +1429,8 @@
           <w:ilvl w:val="0"/>
           <w:numId w:val="3"/>
         </w:numPr>
-        <w:snapToGrid w:val="1"/>
-        <w:spacing w:before="0" w:after="90" w:line="240"/>
-        <w:rPr/>
+        <w:snapToGrid/>
+        <w:spacing w:before="0" w:after="90" w:line="240" w:lineRule="auto"/>
       </w:pPr>
       <w:r>
         <w:rPr>
@@ -1518,9 +1448,8 @@
           <w:ilvl w:val="0"/>
           <w:numId w:val="3"/>
         </w:numPr>
-        <w:snapToGrid w:val="1"/>
-        <w:spacing w:before="0" w:after="90" w:line="240"/>
-        <w:rPr/>
+        <w:snapToGrid/>
+        <w:spacing w:before="0" w:after="90" w:line="240" w:lineRule="auto"/>
       </w:pPr>
       <w:r>
         <w:rPr>
@@ -1538,9 +1467,8 @@
           <w:ilvl w:val="0"/>
           <w:numId w:val="3"/>
         </w:numPr>
-        <w:snapToGrid w:val="1"/>
-        <w:spacing w:before="0" w:after="90" w:line="240"/>
-        <w:rPr/>
+        <w:snapToGrid/>
+        <w:spacing w:before="0" w:after="90" w:line="240" w:lineRule="auto"/>
       </w:pPr>
       <w:r>
         <w:rPr>
@@ -1558,9 +1486,8 @@
           <w:ilvl w:val="0"/>
           <w:numId w:val="3"/>
         </w:numPr>
-        <w:snapToGrid w:val="1"/>
-        <w:spacing w:before="0" w:after="90" w:line="240"/>
-        <w:rPr/>
+        <w:snapToGrid/>
+        <w:spacing w:before="0" w:after="90" w:line="240" w:lineRule="auto"/>
       </w:pPr>
       <w:r>
         <w:rPr>
@@ -1578,9 +1505,8 @@
           <w:ilvl w:val="0"/>
           <w:numId w:val="3"/>
         </w:numPr>
-        <w:snapToGrid w:val="1"/>
-        <w:spacing w:before="0" w:after="90" w:line="240"/>
-        <w:rPr/>
+        <w:snapToGrid/>
+        <w:spacing w:before="0" w:after="90" w:line="240" w:lineRule="auto"/>
       </w:pPr>
       <w:r>
         <w:rPr>
@@ -1598,9 +1524,8 @@
           <w:ilvl w:val="0"/>
           <w:numId w:val="3"/>
         </w:numPr>
-        <w:snapToGrid w:val="1"/>
-        <w:spacing w:before="0" w:after="90" w:line="240"/>
-        <w:rPr/>
+        <w:snapToGrid/>
+        <w:spacing w:before="0" w:after="90" w:line="240" w:lineRule="auto"/>
       </w:pPr>
       <w:r>
         <w:rPr>
@@ -1618,9 +1543,8 @@
           <w:ilvl w:val="0"/>
           <w:numId w:val="3"/>
         </w:numPr>
-        <w:snapToGrid w:val="1"/>
-        <w:spacing w:before="0" w:after="90" w:line="240"/>
-        <w:rPr/>
+        <w:snapToGrid/>
+        <w:spacing w:before="0" w:after="90" w:line="240" w:lineRule="auto"/>
       </w:pPr>
       <w:r>
         <w:rPr>
@@ -1638,9 +1562,8 @@
           <w:ilvl w:val="0"/>
           <w:numId w:val="3"/>
         </w:numPr>
-        <w:snapToGrid w:val="1"/>
-        <w:spacing w:before="0" w:after="90" w:line="240"/>
-        <w:rPr/>
+        <w:snapToGrid/>
+        <w:spacing w:before="0" w:after="90" w:line="240" w:lineRule="auto"/>
       </w:pPr>
       <w:r>
         <w:rPr>
@@ -1658,9 +1581,8 @@
           <w:ilvl w:val="0"/>
           <w:numId w:val="3"/>
         </w:numPr>
-        <w:snapToGrid w:val="1"/>
-        <w:spacing w:before="0" w:after="90" w:line="240"/>
-        <w:rPr/>
+        <w:snapToGrid/>
+        <w:spacing w:before="0" w:after="90" w:line="240" w:lineRule="auto"/>
       </w:pPr>
       <w:r>
         <w:rPr>
@@ -1678,9 +1600,8 @@
           <w:ilvl w:val="0"/>
           <w:numId w:val="3"/>
         </w:numPr>
-        <w:snapToGrid w:val="1"/>
-        <w:spacing w:before="0" w:after="360" w:line="240"/>
-        <w:rPr/>
+        <w:snapToGrid/>
+        <w:spacing w:before="0" w:after="360" w:line="240" w:lineRule="auto"/>
       </w:pPr>
       <w:r>
         <w:rPr>
@@ -1694,11 +1615,9 @@
     </w:p>
     <w:p>
       <w:pPr>
-        <w:pStyle w:val="000005"/>
-        <w:rPr/>
-      </w:pPr>
-      <w:r>
-        <w:rPr/>
+        <w:pStyle w:val="5"/>
+      </w:pPr>
+      <w:r>
         <w:t>四、 胡同深处与老城街巷</w:t>
       </w:r>
     </w:p>
@@ -1708,9 +1627,8 @@
           <w:ilvl w:val="0"/>
           <w:numId w:val="4"/>
         </w:numPr>
-        <w:snapToGrid w:val="1"/>
-        <w:spacing w:before="0" w:after="90" w:line="240"/>
-        <w:rPr/>
+        <w:snapToGrid/>
+        <w:spacing w:before="0" w:after="90" w:line="240" w:lineRule="auto"/>
       </w:pPr>
       <w:r>
         <w:rPr>
@@ -1728,9 +1646,8 @@
           <w:ilvl w:val="0"/>
           <w:numId w:val="4"/>
         </w:numPr>
-        <w:snapToGrid w:val="1"/>
-        <w:spacing w:before="0" w:after="90" w:line="240"/>
-        <w:rPr/>
+        <w:snapToGrid/>
+        <w:spacing w:before="0" w:after="90" w:line="240" w:lineRule="auto"/>
       </w:pPr>
       <w:r>
         <w:rPr>
@@ -1748,9 +1665,8 @@
           <w:ilvl w:val="0"/>
           <w:numId w:val="4"/>
         </w:numPr>
-        <w:snapToGrid w:val="1"/>
-        <w:spacing w:before="0" w:after="90" w:line="240"/>
-        <w:rPr/>
+        <w:snapToGrid/>
+        <w:spacing w:before="0" w:after="90" w:line="240" w:lineRule="auto"/>
       </w:pPr>
       <w:r>
         <w:rPr>
@@ -1768,9 +1684,8 @@
           <w:ilvl w:val="0"/>
           <w:numId w:val="4"/>
         </w:numPr>
-        <w:snapToGrid w:val="1"/>
-        <w:spacing w:before="0" w:after="90" w:line="240"/>
-        <w:rPr/>
+        <w:snapToGrid/>
+        <w:spacing w:before="0" w:after="90" w:line="240" w:lineRule="auto"/>
       </w:pPr>
       <w:r>
         <w:rPr>
@@ -1788,9 +1703,8 @@
           <w:ilvl w:val="0"/>
           <w:numId w:val="4"/>
         </w:numPr>
-        <w:snapToGrid w:val="1"/>
-        <w:spacing w:before="0" w:after="90" w:line="240"/>
-        <w:rPr/>
+        <w:snapToGrid/>
+        <w:spacing w:before="0" w:after="90" w:line="240" w:lineRule="auto"/>
       </w:pPr>
       <w:r>
         <w:rPr>
@@ -1808,9 +1722,8 @@
           <w:ilvl w:val="0"/>
           <w:numId w:val="4"/>
         </w:numPr>
-        <w:snapToGrid w:val="1"/>
-        <w:spacing w:before="0" w:after="90" w:line="240"/>
-        <w:rPr/>
+        <w:snapToGrid/>
+        <w:spacing w:before="0" w:after="90" w:line="240" w:lineRule="auto"/>
       </w:pPr>
       <w:r>
         <w:rPr>
@@ -1828,9 +1741,8 @@
           <w:ilvl w:val="0"/>
           <w:numId w:val="4"/>
         </w:numPr>
-        <w:snapToGrid w:val="1"/>
-        <w:spacing w:before="0" w:after="90" w:line="240"/>
-        <w:rPr/>
+        <w:snapToGrid/>
+        <w:spacing w:before="0" w:after="90" w:line="240" w:lineRule="auto"/>
       </w:pPr>
       <w:r>
         <w:rPr>
@@ -1848,9 +1760,8 @@
           <w:ilvl w:val="0"/>
           <w:numId w:val="4"/>
         </w:numPr>
-        <w:snapToGrid w:val="1"/>
-        <w:spacing w:before="0" w:after="90" w:line="240"/>
-        <w:rPr/>
+        <w:snapToGrid/>
+        <w:spacing w:before="0" w:after="90" w:line="240" w:lineRule="auto"/>
       </w:pPr>
       <w:r>
         <w:rPr>
@@ -1868,9 +1779,8 @@
           <w:ilvl w:val="0"/>
           <w:numId w:val="4"/>
         </w:numPr>
-        <w:snapToGrid w:val="1"/>
-        <w:spacing w:before="0" w:after="90" w:line="240"/>
-        <w:rPr/>
+        <w:snapToGrid/>
+        <w:spacing w:before="0" w:after="90" w:line="240" w:lineRule="auto"/>
       </w:pPr>
       <w:r>
         <w:rPr>
@@ -1888,9 +1798,8 @@
           <w:ilvl w:val="0"/>
           <w:numId w:val="4"/>
         </w:numPr>
-        <w:snapToGrid w:val="1"/>
-        <w:spacing w:before="0" w:after="90" w:line="240"/>
-        <w:rPr/>
+        <w:snapToGrid/>
+        <w:spacing w:before="0" w:after="90" w:line="240" w:lineRule="auto"/>
       </w:pPr>
       <w:r>
         <w:rPr>
@@ -1908,9 +1817,8 @@
           <w:ilvl w:val="0"/>
           <w:numId w:val="4"/>
         </w:numPr>
-        <w:snapToGrid w:val="1"/>
-        <w:spacing w:before="0" w:after="90" w:line="240"/>
-        <w:rPr/>
+        <w:snapToGrid/>
+        <w:spacing w:before="0" w:after="90" w:line="240" w:lineRule="auto"/>
       </w:pPr>
       <w:r>
         <w:rPr>
@@ -1928,9 +1836,8 @@
           <w:ilvl w:val="0"/>
           <w:numId w:val="4"/>
         </w:numPr>
-        <w:snapToGrid w:val="1"/>
-        <w:spacing w:before="0" w:after="90" w:line="240"/>
-        <w:rPr/>
+        <w:snapToGrid/>
+        <w:spacing w:before="0" w:after="90" w:line="240" w:lineRule="auto"/>
       </w:pPr>
       <w:r>
         <w:rPr>
@@ -1948,9 +1855,8 @@
           <w:ilvl w:val="0"/>
           <w:numId w:val="4"/>
         </w:numPr>
-        <w:snapToGrid w:val="1"/>
-        <w:spacing w:before="0" w:after="90" w:line="240"/>
-        <w:rPr/>
+        <w:snapToGrid/>
+        <w:spacing w:before="0" w:after="90" w:line="240" w:lineRule="auto"/>
       </w:pPr>
       <w:r>
         <w:rPr>
@@ -1968,9 +1874,8 @@
           <w:ilvl w:val="0"/>
           <w:numId w:val="4"/>
         </w:numPr>
-        <w:snapToGrid w:val="1"/>
-        <w:spacing w:before="0" w:after="90" w:line="240"/>
-        <w:rPr/>
+        <w:snapToGrid/>
+        <w:spacing w:before="0" w:after="90" w:line="240" w:lineRule="auto"/>
       </w:pPr>
       <w:r>
         <w:rPr>
@@ -1988,9 +1893,8 @@
           <w:ilvl w:val="0"/>
           <w:numId w:val="4"/>
         </w:numPr>
-        <w:snapToGrid w:val="1"/>
-        <w:spacing w:before="0" w:after="90" w:line="240"/>
-        <w:rPr/>
+        <w:snapToGrid/>
+        <w:spacing w:before="0" w:after="90" w:line="240" w:lineRule="auto"/>
       </w:pPr>
       <w:r>
         <w:rPr>
@@ -2008,9 +1912,8 @@
           <w:ilvl w:val="0"/>
           <w:numId w:val="4"/>
         </w:numPr>
-        <w:snapToGrid w:val="1"/>
-        <w:spacing w:before="0" w:after="90" w:line="240"/>
-        <w:rPr/>
+        <w:snapToGrid/>
+        <w:spacing w:before="0" w:after="90" w:line="240" w:lineRule="auto"/>
       </w:pPr>
       <w:r>
         <w:rPr>
@@ -2028,9 +1931,8 @@
           <w:ilvl w:val="0"/>
           <w:numId w:val="4"/>
         </w:numPr>
-        <w:snapToGrid w:val="1"/>
-        <w:spacing w:before="0" w:after="90" w:line="240"/>
-        <w:rPr/>
+        <w:snapToGrid/>
+        <w:spacing w:before="0" w:after="90" w:line="240" w:lineRule="auto"/>
       </w:pPr>
       <w:r>
         <w:rPr>
@@ -2048,9 +1950,8 @@
           <w:ilvl w:val="0"/>
           <w:numId w:val="4"/>
         </w:numPr>
-        <w:snapToGrid w:val="1"/>
-        <w:spacing w:before="0" w:after="90" w:line="240"/>
-        <w:rPr/>
+        <w:snapToGrid/>
+        <w:spacing w:before="0" w:after="90" w:line="240" w:lineRule="auto"/>
       </w:pPr>
       <w:r>
         <w:rPr>
@@ -2068,9 +1969,8 @@
           <w:ilvl w:val="0"/>
           <w:numId w:val="4"/>
         </w:numPr>
-        <w:snapToGrid w:val="1"/>
-        <w:spacing w:before="0" w:after="360" w:line="240"/>
-        <w:rPr/>
+        <w:snapToGrid/>
+        <w:spacing w:before="0" w:after="360" w:line="240" w:lineRule="auto"/>
       </w:pPr>
       <w:r>
         <w:rPr>
@@ -2084,11 +1984,9 @@
     </w:p>
     <w:p>
       <w:pPr>
-        <w:pStyle w:val="000005"/>
-        <w:rPr/>
-      </w:pPr>
-      <w:r>
-        <w:rPr/>
+        <w:pStyle w:val="5"/>
+      </w:pPr>
+      <w:r>
         <w:t>五、 文娱体验与城市漫游</w:t>
       </w:r>
     </w:p>
@@ -2098,9 +1996,8 @@
           <w:ilvl w:val="0"/>
           <w:numId w:val="5"/>
         </w:numPr>
-        <w:snapToGrid w:val="1"/>
-        <w:spacing w:before="0" w:after="90" w:line="240"/>
-        <w:rPr/>
+        <w:snapToGrid/>
+        <w:spacing w:before="0" w:after="90" w:line="240" w:lineRule="auto"/>
       </w:pPr>
       <w:r>
         <w:rPr>
@@ -2118,9 +2015,8 @@
           <w:ilvl w:val="0"/>
           <w:numId w:val="5"/>
         </w:numPr>
-        <w:snapToGrid w:val="1"/>
-        <w:spacing w:before="0" w:after="90" w:line="240"/>
-        <w:rPr/>
+        <w:snapToGrid/>
+        <w:spacing w:before="0" w:after="90" w:line="240" w:lineRule="auto"/>
       </w:pPr>
       <w:r>
         <w:rPr>
@@ -2138,9 +2034,8 @@
           <w:ilvl w:val="0"/>
           <w:numId w:val="5"/>
         </w:numPr>
-        <w:snapToGrid w:val="1"/>
-        <w:spacing w:before="0" w:after="90" w:line="240"/>
-        <w:rPr/>
+        <w:snapToGrid/>
+        <w:spacing w:before="0" w:after="90" w:line="240" w:lineRule="auto"/>
       </w:pPr>
       <w:r>
         <w:rPr>
@@ -2158,9 +2053,8 @@
           <w:ilvl w:val="0"/>
           <w:numId w:val="5"/>
         </w:numPr>
-        <w:snapToGrid w:val="1"/>
-        <w:spacing w:before="0" w:after="90" w:line="240"/>
-        <w:rPr/>
+        <w:snapToGrid/>
+        <w:spacing w:before="0" w:after="90" w:line="240" w:lineRule="auto"/>
       </w:pPr>
       <w:r>
         <w:rPr>
@@ -2178,9 +2072,8 @@
           <w:ilvl w:val="0"/>
           <w:numId w:val="5"/>
         </w:numPr>
-        <w:snapToGrid w:val="1"/>
-        <w:spacing w:before="0" w:after="90" w:line="240"/>
-        <w:rPr/>
+        <w:snapToGrid/>
+        <w:spacing w:before="0" w:after="90" w:line="240" w:lineRule="auto"/>
       </w:pPr>
       <w:r>
         <w:rPr>
@@ -2199,12 +2092,10 @@
           <w:numId w:val="5"/>
         </w:numPr>
         <w:pBdr>
-          <w:bottom/>
+          <w:bottom w:val="none" w:color="auto" w:sz="0" w:space="0"/>
         </w:pBdr>
-        <w:snapToGrid w:val="1"/>
-        <w:spacing w:before="0" w:after="90" w:line="240"/>
-        <w:ind/>
-        <w:rPr/>
+        <w:snapToGrid/>
+        <w:spacing w:before="0" w:after="90" w:line="240" w:lineRule="auto"/>
       </w:pPr>
       <w:r>
         <w:rPr>
@@ -2219,17 +2110,45 @@
     <w:sectPr>
       <w:pgSz w:w="11906" w:h="16838"/>
       <w:pgMar w:top="1440" w:right="1797" w:bottom="1440" w:left="1797" w:header="851" w:footer="992" w:gutter="0"/>
-      <w:cols w:space="0"/>
-      <w:docGrid w:type="lines" w:linePitch="387"/>
+      <w:cols w:space="0" w:num="1"/>
+      <w:docGrid w:type="lines" w:linePitch="387" w:charSpace="0"/>
     </w:sectPr>
   </w:body>
 </w:document>
 </file>
 
+<file path=word/footnotes.xml><?xml version="1.0" encoding="utf-8"?>
+<w:footnotes xmlns:wpc="http://schemas.microsoft.com/office/word/2010/wordprocessingCanvas" xmlns:mc="http://schemas.openxmlformats.org/markup-compatibility/2006" xmlns:o="urn:schemas-microsoft-com:office:office" xmlns:r="http://schemas.openxmlformats.org/officeDocument/2006/relationships" xmlns:m="http://schemas.openxmlformats.org/officeDocument/2006/math" xmlns:v="urn:schemas-microsoft-com:vml" xmlns:wp14="http://schemas.microsoft.com/office/word/2010/wordprocessingDrawing" xmlns:wp="http://schemas.openxmlformats.org/drawingml/2006/wordprocessingDrawing" xmlns:w="http://schemas.openxmlformats.org/wordprocessingml/2006/main" xmlns:w14="http://schemas.microsoft.com/office/word/2010/wordml" xmlns:w15="http://schemas.microsoft.com/office/word/2012/wordml" xmlns:w10="urn:schemas-microsoft-com:office:word" xmlns:wpg="http://schemas.microsoft.com/office/word/2010/wordprocessingGroup" xmlns:wpi="http://schemas.microsoft.com/office/word/2010/wordprocessingInk" xmlns:wne="http://schemas.microsoft.com/office/word/2006/wordml" xmlns:wps="http://schemas.microsoft.com/office/word/2010/wordprocessingShape" xmlns:wpsCustomData="http://www.wps.cn/officeDocument/2013/wpsCustomData" mc:Ignorable="w14 w15 wp14">
+  <w:footnote w:type="separator" w:id="0">
+    <w:p>
+      <w:pPr>
+        <w:spacing w:before="0" w:after="0"/>
+      </w:pPr>
+      <w:r>
+        <w:separator/>
+      </w:r>
+    </w:p>
+  </w:footnote>
+  <w:footnote w:type="continuationSeparator" w:id="1">
+    <w:p>
+      <w:pPr>
+        <w:spacing w:before="0" w:after="0"/>
+      </w:pPr>
+      <w:r>
+        <w:continuationSeparator/>
+      </w:r>
+    </w:p>
+  </w:footnote>
+</w:footnotes>
+</file>
+
 <file path=word/numbering.xml><?xml version="1.0" encoding="utf-8"?>
-<w:numbering xmlns:w="http://schemas.openxmlformats.org/wordprocessingml/2006/main">
+<w:numbering xmlns:wpc="http://schemas.microsoft.com/office/word/2010/wordprocessingCanvas" xmlns:mc="http://schemas.openxmlformats.org/markup-compatibility/2006" xmlns:o="urn:schemas-microsoft-com:office:office" xmlns:r="http://schemas.openxmlformats.org/officeDocument/2006/relationships" xmlns:m="http://schemas.openxmlformats.org/officeDocument/2006/math" xmlns:v="urn:schemas-microsoft-com:vml" xmlns:wp14="http://schemas.microsoft.com/office/word/2010/wordprocessingDrawing" xmlns:wp="http://schemas.openxmlformats.org/drawingml/2006/wordprocessingDrawing" xmlns:w10="urn:schemas-microsoft-com:office:word" xmlns:w="http://schemas.openxmlformats.org/wordprocessingml/2006/main" xmlns:w14="http://schemas.microsoft.com/office/word/2010/wordml" xmlns:wpg="http://schemas.microsoft.com/office/word/2010/wordprocessingGroup" xmlns:wpi="http://schemas.microsoft.com/office/word/2010/wordprocessingInk" xmlns:wne="http://schemas.microsoft.com/office/word/2006/wordml" xmlns:wps="http://schemas.microsoft.com/office/word/2010/wordprocessingShape" xmlns:wpsCustomData="http://www.wps.cn/officeDocument/2013/wpsCustomData" mc:Ignorable="w14 wp14">
   <w:abstractNum w:abstractNumId="0">
-    <w:lvl w:ilvl="0">
+    <w:nsid w:val="B5E306ED"/>
+    <w:multiLevelType w:val="singleLevel"/>
+    <w:tmpl w:val="B5E306ED"/>
+    <w:lvl w:ilvl="0" w:tentative="0">
       <w:start w:val="1"/>
       <w:numFmt w:val="bullet"/>
       <w:lvlText w:val=""/>
@@ -2237,11 +2156,13 @@
       <w:pPr>
         <w:ind w:left="336" w:hanging="336"/>
       </w:pPr>
-      <w:rPr/>
     </w:lvl>
   </w:abstractNum>
   <w:abstractNum w:abstractNumId="1">
-    <w:lvl w:ilvl="0">
+    <w:nsid w:val="BF205925"/>
+    <w:multiLevelType w:val="singleLevel"/>
+    <w:tmpl w:val="BF205925"/>
+    <w:lvl w:ilvl="0" w:tentative="0">
       <w:start w:val="1"/>
       <w:numFmt w:val="bullet"/>
       <w:lvlText w:val=""/>
@@ -2249,11 +2170,13 @@
       <w:pPr>
         <w:ind w:left="336" w:hanging="336"/>
       </w:pPr>
-      <w:rPr/>
     </w:lvl>
   </w:abstractNum>
   <w:abstractNum w:abstractNumId="2">
-    <w:lvl w:ilvl="0">
+    <w:nsid w:val="CF092B84"/>
+    <w:multiLevelType w:val="singleLevel"/>
+    <w:tmpl w:val="CF092B84"/>
+    <w:lvl w:ilvl="0" w:tentative="0">
       <w:start w:val="1"/>
       <w:numFmt w:val="bullet"/>
       <w:lvlText w:val=""/>
@@ -2261,11 +2184,13 @@
       <w:pPr>
         <w:ind w:left="336" w:hanging="336"/>
       </w:pPr>
-      <w:rPr/>
     </w:lvl>
   </w:abstractNum>
   <w:abstractNum w:abstractNumId="3">
-    <w:lvl w:ilvl="0">
+    <w:nsid w:val="0053208E"/>
+    <w:multiLevelType w:val="singleLevel"/>
+    <w:tmpl w:val="0053208E"/>
+    <w:lvl w:ilvl="0" w:tentative="0">
       <w:start w:val="1"/>
       <w:numFmt w:val="bullet"/>
       <w:lvlText w:val=""/>
@@ -2273,11 +2198,13 @@
       <w:pPr>
         <w:ind w:left="336" w:hanging="336"/>
       </w:pPr>
-      <w:rPr/>
     </w:lvl>
   </w:abstractNum>
   <w:abstractNum w:abstractNumId="4">
-    <w:lvl w:ilvl="0">
+    <w:nsid w:val="59ADCABA"/>
+    <w:multiLevelType w:val="singleLevel"/>
+    <w:tmpl w:val="59ADCABA"/>
+    <w:lvl w:ilvl="0" w:tentative="0">
       <w:start w:val="1"/>
       <w:numFmt w:val="bullet"/>
       <w:lvlText w:val=""/>
@@ -2285,372 +2212,503 @@
       <w:pPr>
         <w:ind w:left="336" w:hanging="336"/>
       </w:pPr>
-      <w:rPr/>
     </w:lvl>
   </w:abstractNum>
-  <w:num w:numId="5">
+  <w:num w:numId="1">
     <w:abstractNumId w:val="3"/>
   </w:num>
   <w:num w:numId="2">
     <w:abstractNumId w:val="2"/>
   </w:num>
-  <w:num w:numId="4">
+  <w:num w:numId="3">
     <w:abstractNumId w:val="4"/>
   </w:num>
-  <w:num w:numId="1">
+  <w:num w:numId="4">
     <w:abstractNumId w:val="1"/>
   </w:num>
-  <w:num w:numId="3">
+  <w:num w:numId="5">
     <w:abstractNumId w:val="0"/>
   </w:num>
 </w:numbering>
 </file>
 
 <file path=word/styles.xml><?xml version="1.0" encoding="utf-8"?>
-<w:styles xmlns:w="http://schemas.openxmlformats.org/wordprocessingml/2006/main">
+<w:styles xmlns:mc="http://schemas.openxmlformats.org/markup-compatibility/2006" xmlns:o="urn:schemas-microsoft-com:office:office" xmlns:r="http://schemas.openxmlformats.org/officeDocument/2006/relationships" xmlns:m="http://schemas.openxmlformats.org/officeDocument/2006/math" xmlns:v="urn:schemas-microsoft-com:vml" xmlns:w="http://schemas.openxmlformats.org/wordprocessingml/2006/main" xmlns:w14="http://schemas.microsoft.com/office/word/2010/wordml" xmlns:w10="urn:schemas-microsoft-com:office:word" xmlns:sl="http://schemas.openxmlformats.org/schemaLibrary/2006/main" xmlns:wpsCustomData="http://www.wps.cn/officeDocument/2013/wpsCustomData" mc:Ignorable="w14">
   <w:docDefaults>
     <w:rPrDefault>
       <w:rPr>
         <w:rFonts w:ascii="Arial" w:hAnsi="Arial" w:eastAsia="微软雅黑" w:cs="Arial"/>
-        <w:lang w:val="en-US" w:eastAsia="zh-CN" w:bidi="ar-SA"/>
       </w:rPr>
     </w:rPrDefault>
     <w:pPrDefault/>
   </w:docDefaults>
-  <w:latentStyles w:defLockedState="0" w:defUIPriority="0" w:defSemiHidden="0" w:defUnhideWhenUsed="0" w:defQFormat="0" w:count="376">
-    <w:lsdException w:name="List Table 6 Colorful Accent 3" w:uiPriority="51"/>
-    <w:lsdException w:name="Table Grid 7" w:semiHidden="1" w:unhideWhenUsed="1"/>
-    <w:lsdException w:name="Hashtag" w:uiPriority="99" w:semiHidden="1" w:unhideWhenUsed="1"/>
-    <w:lsdException w:name="List Table 4 Accent 4" w:uiPriority="49"/>
-    <w:lsdException w:name="Grid Table 7 Colorful Accent 2" w:uiPriority="52"/>
-    <w:lsdException w:name="Table 3D effects 1" w:semiHidden="1" w:unhideWhenUsed="1"/>
-    <w:lsdException w:name="Intense Quote" w:uiPriority="99"/>
-    <w:lsdException w:name="Medium Shading 1 Accent 2" w:uiPriority="63"/>
-    <w:lsdException w:name="heading 2" w:qFormat="1"/>
-    <w:lsdException w:name="Medium List 1 Accent 6" w:uiPriority="65"/>
-    <w:lsdException w:name="Colorful Shading Accent 2" w:uiPriority="71"/>
-    <w:lsdException w:name="Light List Accent 5" w:uiPriority="61"/>
-    <w:lsdException w:name="heading 4" w:qFormat="1"/>
-    <w:lsdException w:name="Light List Accent 1" w:uiPriority="61"/>
-    <w:lsdException w:name="Strong" w:qFormat="1"/>
-    <w:lsdException w:name="Grid Table 3 Accent 6" w:uiPriority="48"/>
-    <w:lsdException w:name="Grid Table 1 Light Accent 3" w:uiPriority="46"/>
-    <w:lsdException w:name="Colorful List Accent 3" w:uiPriority="72"/>
-    <w:lsdException w:name="Medium List 2 Accent 1" w:uiPriority="66"/>
-    <w:lsdException w:name="List Table 2 Accent 4" w:uiPriority="47"/>
-    <w:lsdException w:name="Table Simple 1" w:semiHidden="1" w:unhideWhenUsed="1"/>
-    <w:lsdException w:name="HTML Acronym" w:uiPriority="99"/>
-    <w:lsdException w:name="toc 4" w:uiPriority="99"/>
-    <w:lsdException w:name="List Table 5 Dark" w:uiPriority="50"/>
-    <w:lsdException w:name="Colorful List Accent 1" w:uiPriority="72"/>
-    <w:lsdException w:name="Table List 8" w:semiHidden="1" w:unhideWhenUsed="1"/>
-    <w:lsdException w:name="Table List 1" w:semiHidden="1" w:unhideWhenUsed="1"/>
-    <w:lsdException w:name="Normal Table" w:uiPriority="99" w:semiHidden="1" w:unhideWhenUsed="1"/>
-    <w:lsdException w:name="Medium Grid 1 Accent 2" w:uiPriority="67"/>
-    <w:lsdException w:name="Table Colorful 3" w:semiHidden="1" w:unhideWhenUsed="1"/>
-    <w:lsdException w:name="Medium List 1 Accent 2" w:uiPriority="65"/>
-    <w:lsdException w:name="Table Professional" w:semiHidden="1" w:unhideWhenUsed="1"/>
-    <w:lsdException w:name="Table Grid 4" w:semiHidden="1" w:unhideWhenUsed="1"/>
-    <w:lsdException w:name="Subtle Emphasis" w:uiPriority="19" w:qFormat="1"/>
-    <w:lsdException w:name="Medium List 2 Accent 4" w:uiPriority="66"/>
-    <w:lsdException w:name="Table Grid" w:qFormat="1"/>
-    <w:lsdException w:name="List Table 2 Accent 5" w:uiPriority="47"/>
-    <w:lsdException w:name="heading 6" w:qFormat="1"/>
-    <w:lsdException w:name="List Table 2 Accent 3" w:uiPriority="47"/>
-    <w:lsdException w:name="Dark List" w:uiPriority="70"/>
-    <w:lsdException w:name="List Table 1 Light Accent 2" w:uiPriority="46"/>
-    <w:lsdException w:name="Table Columns 3" w:semiHidden="1" w:unhideWhenUsed="1"/>
-    <w:lsdException w:name="List Table 4 Accent 1" w:uiPriority="49"/>
-    <w:lsdException w:name="Light Shading" w:uiPriority="60"/>
-    <w:lsdException w:name="Medium Shading 2 Accent 6" w:uiPriority="64"/>
-    <w:lsdException w:name="Light Shading Accent 2" w:uiPriority="60"/>
-    <w:lsdException w:name="List Table 7 Colorful Accent 5" w:uiPriority="52"/>
-    <w:lsdException w:name="Grid Table 2 Accent 6" w:uiPriority="47"/>
-    <w:lsdException w:name="heading 5" w:qFormat="1"/>
-    <w:lsdException w:name="Light List Accent 4" w:uiPriority="61"/>
-    <w:lsdException w:name="Table Theme" w:semiHidden="1" w:unhideWhenUsed="1"/>
-    <w:lsdException w:name="Grid Table 4 Accent 5" w:uiPriority="49"/>
-    <w:lsdException w:name="Medium Grid 3 Accent 3" w:uiPriority="69"/>
-    <w:lsdException w:name="Grid Table 1 Light Accent 1" w:uiPriority="46"/>
-    <w:lsdException w:name="Grid Table 4 Accent 4" w:uiPriority="49"/>
-    <w:lsdException w:name="Subtitle" w:qFormat="1"/>
-    <w:lsdException w:name="Grid Table 3 Accent 5" w:uiPriority="48"/>
-    <w:lsdException w:name="Placeholder Text" w:uiPriority="99" w:semiHidden="1"/>
-    <w:lsdException w:name="Light Shading Accent 1" w:uiPriority="60"/>
-    <w:lsdException w:name="HTML Typewriter" w:uiPriority="99"/>
-    <w:lsdException w:name="Table List 5" w:semiHidden="1" w:unhideWhenUsed="1"/>
-    <w:lsdException w:name="List Table 1 Light Accent 3" w:uiPriority="46"/>
-    <w:lsdException w:name="List Table 5 Dark Accent 1" w:uiPriority="50"/>
-    <w:lsdException w:name="Grid Table 1 Light Accent 5" w:uiPriority="46"/>
-    <w:lsdException w:name="Medium List 2 Accent 5" w:uiPriority="66"/>
-    <w:lsdException w:name="List Table 7 Colorful Accent 3" w:uiPriority="52"/>
-    <w:lsdException w:name="Medium Grid 3 Accent 4" w:uiPriority="69"/>
-    <w:lsdException w:name="Plain Table 2" w:uiPriority="42"/>
-    <w:lsdException w:name="HTML Cite" w:uiPriority="99"/>
-    <w:lsdException w:name="Grid Table 7 Colorful Accent 3" w:uiPriority="52"/>
-    <w:lsdException w:name="Colorful List Accent 2" w:uiPriority="72"/>
-    <w:lsdException w:name="List Table 3 Accent 5" w:uiPriority="48"/>
-    <w:lsdException w:name="Medium Shading 2 Accent 1" w:uiPriority="64"/>
-    <w:lsdException w:name="Colorful Grid Accent 6" w:uiPriority="73"/>
-    <w:lsdException w:name="List Table 6 Colorful Accent 5" w:uiPriority="51"/>
-    <w:lsdException w:name="Colorful List Accent 4" w:uiPriority="72"/>
-    <w:lsdException w:name="footnote reference" w:uiPriority="99" w:semiHidden="1" w:unhideWhenUsed="1"/>
-    <w:lsdException w:name="footnote text" w:uiPriority="99" w:semiHidden="1" w:unhideWhenUsed="1"/>
-    <w:lsdException w:name="Light Shading Accent 5" w:uiPriority="60"/>
-    <w:lsdException w:name="Table Grid 6" w:semiHidden="1" w:unhideWhenUsed="1"/>
-    <w:lsdException w:name="Light Grid Accent 1" w:uiPriority="62"/>
-    <w:lsdException w:name="List Table 5 Dark Accent 2" w:uiPriority="50"/>
-    <w:lsdException w:name="heading 7" w:unhideWhenUsed="1" w:qFormat="1"/>
-    <w:lsdException w:name="Default Paragraph Font" w:uiPriority="1" w:semiHidden="1" w:unhideWhenUsed="1"/>
-    <w:lsdException w:name="Dark List Accent 3" w:uiPriority="70"/>
-    <w:lsdException w:name="Unresolved Mention" w:uiPriority="99" w:semiHidden="1" w:unhideWhenUsed="1"/>
-    <w:lsdException w:name="HTML Keyboard" w:uiPriority="99"/>
-    <w:lsdException w:name="No Spacing" w:uiPriority="99"/>
-    <w:lsdException w:name="No List" w:uiPriority="99" w:semiHidden="1" w:unhideWhenUsed="1"/>
-    <w:lsdException w:name="Table Simple 3" w:semiHidden="1" w:unhideWhenUsed="1"/>
-    <w:lsdException w:name="toc 2" w:uiPriority="99"/>
-    <w:lsdException w:name="Grid Table 3" w:uiPriority="48"/>
-    <w:lsdException w:name="List Table 7 Colorful" w:uiPriority="52"/>
-    <w:lsdException w:name="Table List 7" w:semiHidden="1" w:unhideWhenUsed="1"/>
-    <w:lsdException w:name="toc 5" w:uiPriority="99"/>
-    <w:lsdException w:name="Medium List 1 Accent 4" w:uiPriority="65"/>
-    <w:lsdException w:name="toc 6" w:uiPriority="99"/>
-    <w:lsdException w:name="List Table 1 Light Accent 6" w:uiPriority="46"/>
-    <w:lsdException w:name="Outline List 3" w:uiPriority="99" w:semiHidden="1" w:unhideWhenUsed="1"/>
-    <w:lsdException w:name="Light List" w:uiPriority="61"/>
-    <w:lsdException w:name="List Table 4" w:uiPriority="49"/>
-    <w:lsdException w:name="List Table 2 Accent 1" w:uiPriority="47"/>
-    <w:lsdException w:name="Table Web 1" w:semiHidden="1" w:unhideWhenUsed="1"/>
-    <w:lsdException w:name="Bibliography" w:uiPriority="37" w:semiHidden="1" w:unhideWhenUsed="1"/>
-    <w:lsdException w:name="Grid Table 5 Dark Accent 4" w:uiPriority="50"/>
-    <w:lsdException w:name="Grid Table Light" w:uiPriority="40"/>
-    <w:lsdException w:name="toc 8" w:uiPriority="99"/>
-    <w:lsdException w:name="Colorful List Accent 6" w:uiPriority="72"/>
-    <w:lsdException w:name="Outline List 2" w:uiPriority="99" w:semiHidden="1" w:unhideWhenUsed="1"/>
-    <w:lsdException w:name="Colorful Grid Accent 4" w:uiPriority="73"/>
-    <w:lsdException w:name="Grid Table 3 Accent 1" w:uiPriority="48"/>
-    <w:lsdException w:name="Medium Shading 2" w:uiPriority="64"/>
-    <w:lsdException w:name="Table Colorful 2" w:semiHidden="1" w:unhideWhenUsed="1"/>
-    <w:lsdException w:name="Medium Shading 1 Accent 6" w:uiPriority="63"/>
-    <w:lsdException w:name="Table Classic 3" w:semiHidden="1" w:unhideWhenUsed="1"/>
-    <w:lsdException w:name="Grid Table 2" w:uiPriority="47"/>
-    <w:lsdException w:name="Dark List Accent 4" w:uiPriority="70"/>
-    <w:lsdException w:name="Medium List 2" w:uiPriority="66"/>
-    <w:lsdException w:name="Table List 6" w:semiHidden="1" w:unhideWhenUsed="1"/>
-    <w:lsdException w:name="Grid Table 4" w:uiPriority="49"/>
-    <w:lsdException w:name="Table Columns 5" w:semiHidden="1" w:unhideWhenUsed="1"/>
-    <w:lsdException w:name="Medium Grid 1 Accent 6" w:uiPriority="67"/>
-    <w:lsdException w:name="Colorful Shading Accent 3" w:uiPriority="71"/>
-    <w:lsdException w:name="Grid Table 2 Accent 3" w:uiPriority="47"/>
-    <w:lsdException w:name="Table Columns 2" w:semiHidden="1" w:unhideWhenUsed="1"/>
-    <w:lsdException w:name="HTML Top of Form" w:uiPriority="99" w:semiHidden="1" w:unhideWhenUsed="1"/>
-    <w:lsdException w:name="Medium Grid 1" w:uiPriority="67"/>
-    <w:lsdException w:name="Light Grid" w:uiPriority="62"/>
-    <w:lsdException w:name="HTML Sample" w:uiPriority="99"/>
-    <w:lsdException w:name="Grid Table 3 Accent 3" w:uiPriority="48"/>
-    <w:lsdException w:name="Medium Grid 2 Accent 1" w:uiPriority="68"/>
-    <w:lsdException w:name="Colorful List Accent 5" w:uiPriority="72"/>
-    <w:lsdException w:name="HTML Definition" w:uiPriority="99"/>
-    <w:lsdException w:name="List Table 1 Light" w:uiPriority="46"/>
-    <w:lsdException w:name="Medium Grid 2 Accent 4" w:uiPriority="68"/>
-    <w:lsdException w:name="Medium Shading 2 Accent 5" w:uiPriority="64"/>
-    <w:lsdException w:name="Smart Hyperlink" w:uiPriority="99" w:semiHidden="1" w:unhideWhenUsed="1"/>
-    <w:lsdException w:name="Outline List 1" w:uiPriority="99" w:semiHidden="1" w:unhideWhenUsed="1"/>
-    <w:lsdException w:name="Grid Table 7 Colorful" w:uiPriority="52"/>
-    <w:lsdException w:name="Grid Table 6 Colorful Accent 5" w:uiPriority="51"/>
-    <w:lsdException w:name="Plain Table 5" w:uiPriority="45"/>
-    <w:lsdException w:name="heading 9" w:unhideWhenUsed="1" w:qFormat="1"/>
-    <w:lsdException w:name="Colorful Grid Accent 3" w:uiPriority="73"/>
-    <w:lsdException w:name="Grid Table 3 Accent 2" w:uiPriority="48"/>
-    <w:lsdException w:name="Colorful Shading Accent 6" w:uiPriority="71"/>
-    <w:lsdException w:name="Grid Table 2 Accent 1" w:uiPriority="47"/>
-    <w:lsdException w:name="Medium Shading 1" w:uiPriority="63"/>
-    <w:lsdException w:name="Colorful Shading Accent 5" w:uiPriority="71"/>
-    <w:lsdException w:name="Table List 4" w:semiHidden="1" w:unhideWhenUsed="1"/>
-    <w:lsdException w:name="Grid Table 6 Colorful Accent 4" w:uiPriority="51"/>
-    <w:lsdException w:name="heading 3" w:qFormat="1"/>
-    <w:lsdException w:name="Medium Shading 1 Accent 1" w:uiPriority="63"/>
-    <w:lsdException w:name="Intense Emphasis" w:uiPriority="21" w:qFormat="1"/>
-    <w:lsdException w:name="Colorful Shading" w:uiPriority="71"/>
-    <w:lsdException w:name="Grid Table 6 Colorful Accent 6" w:uiPriority="51"/>
-    <w:lsdException w:name="Table 3D effects 3" w:semiHidden="1" w:unhideWhenUsed="1"/>
-    <w:lsdException w:name="Table Grid 5" w:semiHidden="1" w:unhideWhenUsed="1"/>
-    <w:lsdException w:name="Plain Table 4" w:uiPriority="44"/>
-    <w:lsdException w:name="Medium Grid 1 Accent 5" w:uiPriority="67"/>
-    <w:lsdException w:name="List Table 2 Accent 6" w:uiPriority="47"/>
-    <w:lsdException w:name="List Table 4 Accent 6" w:uiPriority="49"/>
-    <w:lsdException w:name="List Table 3" w:uiPriority="48"/>
-    <w:lsdException w:name="Medium Shading 2 Accent 3" w:uiPriority="64"/>
-    <w:lsdException w:name="Colorful Grid" w:uiPriority="73"/>
-    <w:lsdException w:name="Table Web 2" w:semiHidden="1" w:unhideWhenUsed="1"/>
-    <w:lsdException w:name="Grid Table 1 Light Accent 2" w:uiPriority="46"/>
-    <w:lsdException w:name="List Table 6 Colorful" w:uiPriority="51"/>
-    <w:lsdException w:name="Medium List 1" w:uiPriority="65"/>
-    <w:lsdException w:name="List Table 1 Light Accent 4" w:uiPriority="46"/>
-    <w:lsdException w:name="Light List Accent 3" w:uiPriority="61"/>
-    <w:lsdException w:name="List Table 4 Accent 3" w:uiPriority="49"/>
-    <w:lsdException w:name="Grid Table 6 Colorful" w:uiPriority="51"/>
-    <w:lsdException w:name="Light Grid Accent 2" w:uiPriority="62"/>
-    <w:lsdException w:name="Grid Table 6 Colorful Accent 2" w:uiPriority="51"/>
-    <w:lsdException w:name="Grid Table 1 Light Accent 4" w:uiPriority="46"/>
-    <w:lsdException w:name="Table Classic 1" w:semiHidden="1" w:unhideWhenUsed="1"/>
-    <w:lsdException w:name="Colorful Grid Accent 1" w:uiPriority="73"/>
-    <w:lsdException w:name="Colorful Shading Accent 1" w:uiPriority="71"/>
-    <w:lsdException w:name="List Table 7 Colorful Accent 1" w:uiPriority="52"/>
-    <w:lsdException w:name="List Table 2 Accent 2" w:uiPriority="47"/>
-    <w:lsdException w:name="Light Shading Accent 6" w:uiPriority="60"/>
-    <w:lsdException w:name="HTML Variable" w:uiPriority="99"/>
-    <w:lsdException w:name="Grid Table 4 Accent 3" w:uiPriority="49"/>
-    <w:lsdException w:name="List Table 6 Colorful Accent 6" w:uiPriority="51"/>
-    <w:lsdException w:name="Medium Shading 2 Accent 4" w:uiPriority="64"/>
-    <w:lsdException w:name="Medium Grid 3 Accent 5" w:uiPriority="69"/>
-    <w:lsdException w:name="List Table 5 Dark Accent 3" w:uiPriority="50"/>
-    <w:lsdException w:name="List Table 6 Colorful Accent 2" w:uiPriority="51"/>
-    <w:lsdException w:name="Medium Grid 1 Accent 1" w:uiPriority="67"/>
-    <w:lsdException w:name="Medium List 1 Accent 3" w:uiPriority="65"/>
-    <w:lsdException w:name="Table Colorful 1" w:semiHidden="1" w:unhideWhenUsed="1"/>
-    <w:lsdException w:name="List Table 6 Colorful Accent 4" w:uiPriority="51"/>
-    <w:lsdException w:name="Grid Table 5 Dark Accent 6" w:uiPriority="50"/>
-    <w:lsdException w:name="heading 8" w:unhideWhenUsed="1" w:qFormat="1"/>
-    <w:lsdException w:name="Table 3D effects 2" w:semiHidden="1" w:unhideWhenUsed="1"/>
-    <w:lsdException w:name="Grid Table 1 Light" w:uiPriority="46"/>
-    <w:lsdException w:name="Table Grid 3" w:semiHidden="1" w:unhideWhenUsed="1"/>
-    <w:lsdException w:name="Emphasis" w:qFormat="1"/>
-    <w:lsdException w:name="Intense Reference" w:uiPriority="32" w:qFormat="1"/>
-    <w:lsdException w:name="Dark List Accent 2" w:uiPriority="70"/>
-    <w:lsdException w:name="HTML Address" w:uiPriority="99"/>
-    <w:lsdException w:name="Medium List 2 Accent 3" w:uiPriority="66"/>
-    <w:lsdException w:name="Grid Table 3 Accent 4" w:uiPriority="48"/>
-    <w:lsdException w:name="Table Classic 4" w:semiHidden="1" w:unhideWhenUsed="1"/>
-    <w:lsdException w:name="HTML Code" w:uiPriority="99"/>
-    <w:lsdException w:name="toc 1" w:uiPriority="99"/>
-    <w:lsdException w:name="Light Grid Accent 6" w:uiPriority="62"/>
-    <w:lsdException w:name="List Table 5 Dark Accent 6" w:uiPriority="50"/>
-    <w:lsdException w:name="Subtle Reference" w:uiPriority="31" w:qFormat="1"/>
-    <w:lsdException w:name="Dark List Accent 5" w:uiPriority="70"/>
-    <w:lsdException w:name="Medium List 1 Accent 1" w:uiPriority="65"/>
-    <w:lsdException w:name="List Table 7 Colorful Accent 4" w:uiPriority="52"/>
-    <w:lsdException w:name="Medium List 1 Accent 5" w:uiPriority="65"/>
-    <w:lsdException w:name="List Table 5 Dark Accent 5" w:uiPriority="50"/>
-    <w:lsdException w:name="Table List 3" w:semiHidden="1" w:unhideWhenUsed="1"/>
-    <w:lsdException w:name="Medium Shading 2 Accent 2" w:uiPriority="64"/>
-    <w:lsdException w:name="Medium Grid 2" w:uiPriority="68"/>
-    <w:lsdException w:name="Light Grid Accent 5" w:uiPriority="62"/>
-    <w:lsdException w:name="Medium Grid 2 Accent 5" w:uiPriority="68"/>
-    <w:lsdException w:name="Grid Table 4 Accent 6" w:uiPriority="49"/>
-    <w:lsdException w:name="Table Columns 4" w:semiHidden="1" w:unhideWhenUsed="1"/>
-    <w:lsdException w:name="Medium Grid 3 Accent 1" w:uiPriority="69"/>
-    <w:lsdException w:name="Medium Grid 3" w:uiPriority="69"/>
-    <w:lsdException w:name="List Table 7 Colorful Accent 2" w:uiPriority="52"/>
-    <w:lsdException w:name="toc 9" w:uiPriority="99"/>
-    <w:lsdException w:name="Light List Accent 6" w:uiPriority="61"/>
-    <w:lsdException w:name="List Table 1 Light Accent 5" w:uiPriority="46"/>
-    <w:lsdException w:name="Table Grid 2" w:semiHidden="1" w:unhideWhenUsed="1"/>
-    <w:lsdException w:name="List Table 3 Accent 6" w:uiPriority="48"/>
-    <w:lsdException w:name="Grid Table 5 Dark" w:uiPriority="50"/>
-    <w:lsdException w:name="Medium List 2 Accent 6" w:uiPriority="66"/>
-    <w:lsdException w:name="Medium Grid 3 Accent 6" w:uiPriority="69"/>
-    <w:lsdException w:name="Light Grid Accent 4" w:uiPriority="62"/>
-    <w:lsdException w:name="List Table 3 Accent 3" w:uiPriority="48"/>
-    <w:lsdException w:name="List Table 6 Colorful Accent 1" w:uiPriority="51"/>
-    <w:lsdException w:name="Grid Table 5 Dark Accent 5" w:uiPriority="50"/>
-    <w:lsdException w:name="Table Grid 1" w:semiHidden="1" w:unhideWhenUsed="1"/>
-    <w:lsdException w:name="Medium Shading 1 Accent 4" w:uiPriority="63"/>
-    <w:lsdException w:name="Grid Table 4 Accent 2" w:uiPriority="49"/>
-    <w:lsdException w:name="List Table 4 Accent 2" w:uiPriority="49"/>
-    <w:lsdException w:name="Table Columns 1" w:semiHidden="1" w:unhideWhenUsed="1"/>
-    <w:lsdException w:name="Colorful Grid Accent 2" w:uiPriority="73"/>
-    <w:lsdException w:name="Smart Link" w:uiPriority="99" w:semiHidden="1" w:unhideWhenUsed="1"/>
-    <w:lsdException w:name="Grid Table 7 Colorful Accent 5" w:uiPriority="52"/>
-    <w:lsdException w:name="Light Grid Accent 3" w:uiPriority="62"/>
-    <w:lsdException w:name="Medium Shading 1 Accent 3" w:uiPriority="63"/>
-    <w:lsdException w:name="Title" w:qFormat="1"/>
-    <w:lsdException w:name="Normal" w:qFormat="1"/>
-    <w:lsdException w:name="HTML Bottom of Form" w:uiPriority="99" w:semiHidden="1" w:unhideWhenUsed="1"/>
-    <w:lsdException w:name="toc 7" w:uiPriority="99"/>
-    <w:lsdException w:name="List Table 3 Accent 2" w:uiPriority="48"/>
-    <w:lsdException w:name="List Table 1 Light Accent 1" w:uiPriority="46"/>
-    <w:lsdException w:name="Grid Table 5 Dark Accent 2" w:uiPriority="50"/>
-    <w:lsdException w:name="Grid Table 2 Accent 2" w:uiPriority="47"/>
-    <w:lsdException w:name="Grid Table 1 Light Accent 6" w:uiPriority="46"/>
-    <w:lsdException w:name="Dark List Accent 6" w:uiPriority="70"/>
-    <w:lsdException w:name="TOC Heading" w:uiPriority="39" w:semiHidden="1" w:unhideWhenUsed="1" w:qFormat="1"/>
-    <w:lsdException w:name="Table Subtle 1" w:semiHidden="1" w:unhideWhenUsed="1"/>
-    <w:lsdException w:name="Medium Grid 2 Accent 3" w:uiPriority="68"/>
-    <w:lsdException w:name="Revision" w:uiPriority="99" w:semiHidden="1"/>
-    <w:lsdException w:name="Colorful List" w:uiPriority="72"/>
-    <w:lsdException w:name="Grid Table 7 Colorful Accent 6" w:uiPriority="52"/>
-    <w:lsdException w:name="Grid Table 4 Accent 1" w:uiPriority="49"/>
-    <w:lsdException w:name="Medium List 2 Accent 2" w:uiPriority="66"/>
-    <w:lsdException w:name="Medium Grid 1 Accent 4" w:uiPriority="67"/>
-    <w:lsdException w:name="Table Contemporary" w:semiHidden="1" w:unhideWhenUsed="1"/>
-    <w:lsdException w:name="Medium Grid 2 Accent 6" w:uiPriority="68"/>
-    <w:lsdException w:name="Grid Table 5 Dark Accent 3" w:uiPriority="50"/>
-    <w:lsdException w:name="Grid Table 2 Accent 5" w:uiPriority="47"/>
-    <w:lsdException w:name="Medium Grid 3 Accent 2" w:uiPriority="69"/>
-    <w:lsdException w:name="List Table 3 Accent 1" w:uiPriority="48"/>
-    <w:lsdException w:name="List Table 4 Accent 5" w:uiPriority="49"/>
-    <w:lsdException w:name="List Table 2" w:uiPriority="47"/>
-    <w:lsdException w:name="Dark List Accent 1" w:uiPriority="70"/>
-    <w:lsdException w:name="Medium Grid 1 Accent 3" w:uiPriority="67"/>
-    <w:lsdException w:name="Grid Table 6 Colorful Accent 1" w:uiPriority="51"/>
-    <w:lsdException w:name="Colorful Shading Accent 4" w:uiPriority="71"/>
-    <w:lsdException w:name="Grid Table 7 Colorful Accent 4" w:uiPriority="52"/>
-    <w:lsdException w:name="List Table 3 Accent 4" w:uiPriority="48"/>
-    <w:lsdException w:name="Table Subtle 2" w:semiHidden="1" w:unhideWhenUsed="1"/>
-    <w:lsdException w:name="Quote" w:uiPriority="99"/>
-    <w:lsdException w:name="Medium Shading 1 Accent 5" w:uiPriority="63"/>
-    <w:lsdException w:name="Grid Table 7 Colorful Accent 1" w:uiPriority="52"/>
-    <w:lsdException w:name="Light List Accent 2" w:uiPriority="61"/>
-    <w:lsdException w:name="Table Grid 8" w:semiHidden="1" w:unhideWhenUsed="1"/>
-    <w:lsdException w:name="List Table 5 Dark Accent 4" w:uiPriority="50"/>
-    <w:lsdException w:name="Table Web 3" w:semiHidden="1" w:unhideWhenUsed="1"/>
-    <w:lsdException w:name="Book Title" w:uiPriority="33" w:qFormat="1"/>
-    <w:lsdException w:name="Grid Table 2 Accent 4" w:uiPriority="47"/>
-    <w:lsdException w:name="Mention" w:uiPriority="99" w:semiHidden="1" w:unhideWhenUsed="1"/>
-    <w:lsdException w:name="Light Shading Accent 3" w:uiPriority="60"/>
-    <w:lsdException w:name="List Paragraph" w:uiPriority="99"/>
-    <w:lsdException w:name="Table Classic 2" w:semiHidden="1" w:unhideWhenUsed="1"/>
-    <w:lsdException w:name="Table Simple 2" w:semiHidden="1" w:unhideWhenUsed="1"/>
-    <w:lsdException w:name="toc 3" w:uiPriority="99"/>
-    <w:lsdException w:name="Table Elegant" w:semiHidden="1" w:unhideWhenUsed="1"/>
-    <w:lsdException w:name="heading 1" w:qFormat="1"/>
-    <w:lsdException w:name="List Table 7 Colorful Accent 6" w:uiPriority="52"/>
-    <w:lsdException w:name="Grid Table 5 Dark Accent 1" w:uiPriority="50"/>
-    <w:lsdException w:name="Light Shading Accent 4" w:uiPriority="60"/>
-    <w:lsdException w:name="Plain Table 1" w:uiPriority="41"/>
-    <w:lsdException w:name="caption" w:semiHidden="1" w:unhideWhenUsed="1" w:qFormat="1"/>
-    <w:lsdException w:name="HTML Preformatted" w:uiPriority="99"/>
-    <w:lsdException w:name="Colorful Grid Accent 5" w:uiPriority="73"/>
-    <w:lsdException w:name="Medium Grid 2 Accent 2" w:uiPriority="68"/>
-    <w:lsdException w:name="Grid Table 6 Colorful Accent 3" w:uiPriority="51"/>
-    <w:lsdException w:name="Table List 2" w:semiHidden="1" w:unhideWhenUsed="1"/>
-    <w:lsdException w:name="Plain Table 3" w:uiPriority="43"/>
+  <w:latentStyles w:count="260" w:defQFormat="0" w:defUnhideWhenUsed="1" w:defSemiHidden="1" w:defUIPriority="99" w:defLockedState="0">
+    <w:lsdException w:qFormat="1" w:unhideWhenUsed="0" w:uiPriority="0" w:semiHidden="0" w:name="Normal"/>
+    <w:lsdException w:qFormat="1" w:unhideWhenUsed="0" w:uiPriority="0" w:semiHidden="0" w:name="heading 1"/>
+    <w:lsdException w:qFormat="1" w:unhideWhenUsed="0" w:uiPriority="0" w:semiHidden="0" w:name="heading 2"/>
+    <w:lsdException w:qFormat="1" w:unhideWhenUsed="0" w:uiPriority="0" w:semiHidden="0" w:name="heading 3"/>
+    <w:lsdException w:qFormat="1" w:unhideWhenUsed="0" w:uiPriority="0" w:semiHidden="0" w:name="heading 4"/>
+    <w:lsdException w:qFormat="1" w:unhideWhenUsed="0" w:uiPriority="0" w:semiHidden="0" w:name="heading 5"/>
+    <w:lsdException w:qFormat="1" w:unhideWhenUsed="0" w:uiPriority="0" w:semiHidden="0" w:name="heading 6"/>
+    <w:lsdException w:qFormat="1" w:uiPriority="0" w:semiHidden="0" w:name="heading 7"/>
+    <w:lsdException w:qFormat="1" w:uiPriority="0" w:semiHidden="0" w:name="heading 8"/>
+    <w:lsdException w:qFormat="1" w:uiPriority="0" w:semiHidden="0" w:name="heading 9"/>
+    <w:lsdException w:unhideWhenUsed="0" w:uiPriority="0" w:semiHidden="0" w:name="index 1"/>
+    <w:lsdException w:unhideWhenUsed="0" w:uiPriority="0" w:semiHidden="0" w:name="index 2"/>
+    <w:lsdException w:unhideWhenUsed="0" w:uiPriority="0" w:semiHidden="0" w:name="index 3"/>
+    <w:lsdException w:unhideWhenUsed="0" w:uiPriority="0" w:semiHidden="0" w:name="index 4"/>
+    <w:lsdException w:unhideWhenUsed="0" w:uiPriority="0" w:semiHidden="0" w:name="index 5"/>
+    <w:lsdException w:unhideWhenUsed="0" w:uiPriority="0" w:semiHidden="0" w:name="index 6"/>
+    <w:lsdException w:unhideWhenUsed="0" w:uiPriority="0" w:semiHidden="0" w:name="index 7"/>
+    <w:lsdException w:unhideWhenUsed="0" w:uiPriority="0" w:semiHidden="0" w:name="index 8"/>
+    <w:lsdException w:unhideWhenUsed="0" w:uiPriority="0" w:semiHidden="0" w:name="index 9"/>
+    <w:lsdException w:unhideWhenUsed="0" w:uiPriority="99" w:semiHidden="0" w:name="toc 1"/>
+    <w:lsdException w:unhideWhenUsed="0" w:uiPriority="99" w:semiHidden="0" w:name="toc 2"/>
+    <w:lsdException w:unhideWhenUsed="0" w:uiPriority="99" w:semiHidden="0" w:name="toc 3"/>
+    <w:lsdException w:unhideWhenUsed="0" w:uiPriority="99" w:semiHidden="0" w:name="toc 4"/>
+    <w:lsdException w:unhideWhenUsed="0" w:uiPriority="99" w:semiHidden="0" w:name="toc 5"/>
+    <w:lsdException w:unhideWhenUsed="0" w:uiPriority="99" w:semiHidden="0" w:name="toc 6"/>
+    <w:lsdException w:unhideWhenUsed="0" w:uiPriority="99" w:semiHidden="0" w:name="toc 7"/>
+    <w:lsdException w:unhideWhenUsed="0" w:uiPriority="99" w:semiHidden="0" w:name="toc 8"/>
+    <w:lsdException w:unhideWhenUsed="0" w:uiPriority="99" w:semiHidden="0" w:name="toc 9"/>
+    <w:lsdException w:unhideWhenUsed="0" w:uiPriority="0" w:semiHidden="0" w:name="Normal Indent"/>
+    <w:lsdException w:uiPriority="99" w:name="footnote text"/>
+    <w:lsdException w:unhideWhenUsed="0" w:uiPriority="0" w:semiHidden="0" w:name="annotation text"/>
+    <w:lsdException w:unhideWhenUsed="0" w:uiPriority="0" w:semiHidden="0" w:name="header"/>
+    <w:lsdException w:unhideWhenUsed="0" w:uiPriority="0" w:semiHidden="0" w:name="footer"/>
+    <w:lsdException w:unhideWhenUsed="0" w:uiPriority="0" w:semiHidden="0" w:name="index heading"/>
+    <w:lsdException w:qFormat="1" w:uiPriority="0" w:name="caption"/>
+    <w:lsdException w:unhideWhenUsed="0" w:uiPriority="0" w:semiHidden="0" w:name="table of figures"/>
+    <w:lsdException w:unhideWhenUsed="0" w:uiPriority="0" w:semiHidden="0" w:name="envelope address"/>
+    <w:lsdException w:unhideWhenUsed="0" w:uiPriority="0" w:semiHidden="0" w:name="envelope return"/>
+    <w:lsdException w:uiPriority="99" w:name="footnote reference"/>
+    <w:lsdException w:unhideWhenUsed="0" w:uiPriority="0" w:semiHidden="0" w:name="annotation reference"/>
+    <w:lsdException w:unhideWhenUsed="0" w:uiPriority="0" w:semiHidden="0" w:name="line number"/>
+    <w:lsdException w:unhideWhenUsed="0" w:uiPriority="0" w:semiHidden="0" w:name="page number"/>
+    <w:lsdException w:unhideWhenUsed="0" w:uiPriority="0" w:semiHidden="0" w:name="endnote reference"/>
+    <w:lsdException w:unhideWhenUsed="0" w:uiPriority="0" w:semiHidden="0" w:name="endnote text"/>
+    <w:lsdException w:unhideWhenUsed="0" w:uiPriority="0" w:semiHidden="0" w:name="table of authorities"/>
+    <w:lsdException w:unhideWhenUsed="0" w:uiPriority="0" w:semiHidden="0" w:name="macro"/>
+    <w:lsdException w:unhideWhenUsed="0" w:uiPriority="0" w:semiHidden="0" w:name="toa heading"/>
+    <w:lsdException w:unhideWhenUsed="0" w:uiPriority="0" w:semiHidden="0" w:name="List"/>
+    <w:lsdException w:unhideWhenUsed="0" w:uiPriority="0" w:semiHidden="0" w:name="List Bullet"/>
+    <w:lsdException w:unhideWhenUsed="0" w:uiPriority="0" w:semiHidden="0" w:name="List Number"/>
+    <w:lsdException w:unhideWhenUsed="0" w:uiPriority="0" w:semiHidden="0" w:name="List 2"/>
+    <w:lsdException w:unhideWhenUsed="0" w:uiPriority="0" w:semiHidden="0" w:name="List 3"/>
+    <w:lsdException w:unhideWhenUsed="0" w:uiPriority="0" w:semiHidden="0" w:name="List 4"/>
+    <w:lsdException w:unhideWhenUsed="0" w:uiPriority="0" w:semiHidden="0" w:name="List 5"/>
+    <w:lsdException w:unhideWhenUsed="0" w:uiPriority="0" w:semiHidden="0" w:name="List Bullet 2"/>
+    <w:lsdException w:unhideWhenUsed="0" w:uiPriority="0" w:semiHidden="0" w:name="List Bullet 3"/>
+    <w:lsdException w:unhideWhenUsed="0" w:uiPriority="0" w:semiHidden="0" w:name="List Bullet 4"/>
+    <w:lsdException w:unhideWhenUsed="0" w:uiPriority="0" w:semiHidden="0" w:name="List Bullet 5"/>
+    <w:lsdException w:unhideWhenUsed="0" w:uiPriority="0" w:semiHidden="0" w:name="List Number 2"/>
+    <w:lsdException w:unhideWhenUsed="0" w:uiPriority="0" w:semiHidden="0" w:name="List Number 3"/>
+    <w:lsdException w:unhideWhenUsed="0" w:uiPriority="0" w:semiHidden="0" w:name="List Number 4"/>
+    <w:lsdException w:unhideWhenUsed="0" w:uiPriority="0" w:semiHidden="0" w:name="List Number 5"/>
+    <w:lsdException w:qFormat="1" w:unhideWhenUsed="0" w:uiPriority="0" w:semiHidden="0" w:name="Title"/>
+    <w:lsdException w:unhideWhenUsed="0" w:uiPriority="0" w:semiHidden="0" w:name="Closing"/>
+    <w:lsdException w:unhideWhenUsed="0" w:uiPriority="0" w:semiHidden="0" w:name="Signature"/>
+    <w:lsdException w:uiPriority="1" w:name="Default Paragraph Font"/>
+    <w:lsdException w:unhideWhenUsed="0" w:uiPriority="0" w:semiHidden="0" w:name="Body Text"/>
+    <w:lsdException w:unhideWhenUsed="0" w:uiPriority="0" w:semiHidden="0" w:name="Body Text Indent"/>
+    <w:lsdException w:unhideWhenUsed="0" w:uiPriority="0" w:semiHidden="0" w:name="List Continue"/>
+    <w:lsdException w:unhideWhenUsed="0" w:uiPriority="0" w:semiHidden="0" w:name="List Continue 2"/>
+    <w:lsdException w:unhideWhenUsed="0" w:uiPriority="0" w:semiHidden="0" w:name="List Continue 3"/>
+    <w:lsdException w:unhideWhenUsed="0" w:uiPriority="0" w:semiHidden="0" w:name="List Continue 4"/>
+    <w:lsdException w:unhideWhenUsed="0" w:uiPriority="0" w:semiHidden="0" w:name="List Continue 5"/>
+    <w:lsdException w:unhideWhenUsed="0" w:uiPriority="0" w:semiHidden="0" w:name="Message Header"/>
+    <w:lsdException w:qFormat="1" w:unhideWhenUsed="0" w:uiPriority="0" w:semiHidden="0" w:name="Subtitle"/>
+    <w:lsdException w:unhideWhenUsed="0" w:uiPriority="0" w:semiHidden="0" w:name="Salutation"/>
+    <w:lsdException w:unhideWhenUsed="0" w:uiPriority="0" w:semiHidden="0" w:name="Date"/>
+    <w:lsdException w:unhideWhenUsed="0" w:uiPriority="0" w:semiHidden="0" w:name="Body Text First Indent"/>
+    <w:lsdException w:unhideWhenUsed="0" w:uiPriority="0" w:semiHidden="0" w:name="Body Text First Indent 2"/>
+    <w:lsdException w:unhideWhenUsed="0" w:uiPriority="0" w:semiHidden="0" w:name="Note Heading"/>
+    <w:lsdException w:unhideWhenUsed="0" w:uiPriority="0" w:semiHidden="0" w:name="Body Text 2"/>
+    <w:lsdException w:unhideWhenUsed="0" w:uiPriority="0" w:semiHidden="0" w:name="Body Text 3"/>
+    <w:lsdException w:unhideWhenUsed="0" w:uiPriority="0" w:semiHidden="0" w:name="Body Text Indent 2"/>
+    <w:lsdException w:unhideWhenUsed="0" w:uiPriority="0" w:semiHidden="0" w:name="Body Text Indent 3"/>
+    <w:lsdException w:unhideWhenUsed="0" w:uiPriority="0" w:semiHidden="0" w:name="Block Text"/>
+    <w:lsdException w:unhideWhenUsed="0" w:uiPriority="0" w:semiHidden="0" w:name="Hyperlink"/>
+    <w:lsdException w:unhideWhenUsed="0" w:uiPriority="0" w:semiHidden="0" w:name="FollowedHyperlink"/>
+    <w:lsdException w:qFormat="1" w:unhideWhenUsed="0" w:uiPriority="0" w:semiHidden="0" w:name="Strong"/>
+    <w:lsdException w:qFormat="1" w:unhideWhenUsed="0" w:uiPriority="0" w:semiHidden="0" w:name="Emphasis"/>
+    <w:lsdException w:unhideWhenUsed="0" w:uiPriority="0" w:semiHidden="0" w:name="Document Map"/>
+    <w:lsdException w:unhideWhenUsed="0" w:uiPriority="0" w:semiHidden="0" w:name="Plain Text"/>
+    <w:lsdException w:unhideWhenUsed="0" w:uiPriority="0" w:semiHidden="0" w:name="E-mail Signature"/>
+    <w:lsdException w:unhideWhenUsed="0" w:uiPriority="0" w:semiHidden="0" w:name="Normal (Web)"/>
+    <w:lsdException w:unhideWhenUsed="0" w:uiPriority="99" w:semiHidden="0" w:name="HTML Acronym"/>
+    <w:lsdException w:unhideWhenUsed="0" w:uiPriority="99" w:semiHidden="0" w:name="HTML Address"/>
+    <w:lsdException w:unhideWhenUsed="0" w:uiPriority="99" w:semiHidden="0" w:name="HTML Cite"/>
+    <w:lsdException w:unhideWhenUsed="0" w:uiPriority="99" w:semiHidden="0" w:name="HTML Code"/>
+    <w:lsdException w:unhideWhenUsed="0" w:uiPriority="99" w:semiHidden="0" w:name="HTML Definition"/>
+    <w:lsdException w:unhideWhenUsed="0" w:uiPriority="99" w:semiHidden="0" w:name="HTML Keyboard"/>
+    <w:lsdException w:unhideWhenUsed="0" w:uiPriority="99" w:semiHidden="0" w:name="HTML Preformatted"/>
+    <w:lsdException w:unhideWhenUsed="0" w:uiPriority="99" w:semiHidden="0" w:name="HTML Sample"/>
+    <w:lsdException w:unhideWhenUsed="0" w:uiPriority="99" w:semiHidden="0" w:name="HTML Typewriter"/>
+    <w:lsdException w:unhideWhenUsed="0" w:uiPriority="99" w:semiHidden="0" w:name="HTML Variable"/>
+    <w:lsdException w:uiPriority="99" w:name="Normal Table"/>
+    <w:lsdException w:unhideWhenUsed="0" w:uiPriority="0" w:semiHidden="0" w:name="annotation subject"/>
+    <w:lsdException w:uiPriority="0" w:name="Table Simple 1"/>
+    <w:lsdException w:uiPriority="0" w:name="Table Simple 2"/>
+    <w:lsdException w:uiPriority="0" w:name="Table Simple 3"/>
+    <w:lsdException w:uiPriority="0" w:name="Table Classic 1"/>
+    <w:lsdException w:uiPriority="0" w:name="Table Classic 2"/>
+    <w:lsdException w:uiPriority="0" w:name="Table Classic 3"/>
+    <w:lsdException w:uiPriority="0" w:name="Table Classic 4"/>
+    <w:lsdException w:uiPriority="0" w:name="Table Colorful 1"/>
+    <w:lsdException w:uiPriority="0" w:name="Table Colorful 2"/>
+    <w:lsdException w:uiPriority="0" w:name="Table Colorful 3"/>
+    <w:lsdException w:uiPriority="0" w:name="Table Columns 1"/>
+    <w:lsdException w:uiPriority="0" w:name="Table Columns 2"/>
+    <w:lsdException w:uiPriority="0" w:name="Table Columns 3"/>
+    <w:lsdException w:uiPriority="0" w:name="Table Columns 4"/>
+    <w:lsdException w:uiPriority="0" w:name="Table Columns 5"/>
+    <w:lsdException w:uiPriority="0" w:name="Table Grid 1"/>
+    <w:lsdException w:uiPriority="0" w:name="Table Grid 2"/>
+    <w:lsdException w:uiPriority="0" w:name="Table Grid 3"/>
+    <w:lsdException w:uiPriority="0" w:name="Table Grid 4"/>
+    <w:lsdException w:uiPriority="0" w:name="Table Grid 5"/>
+    <w:lsdException w:uiPriority="0" w:name="Table Grid 6"/>
+    <w:lsdException w:uiPriority="0" w:name="Table Grid 7"/>
+    <w:lsdException w:uiPriority="0" w:name="Table Grid 8"/>
+    <w:lsdException w:uiPriority="0" w:name="Table List 1"/>
+    <w:lsdException w:uiPriority="0" w:name="Table List 2"/>
+    <w:lsdException w:uiPriority="0" w:name="Table List 3"/>
+    <w:lsdException w:uiPriority="0" w:name="Table List 4"/>
+    <w:lsdException w:uiPriority="0" w:name="Table List 5"/>
+    <w:lsdException w:uiPriority="0" w:name="Table List 6"/>
+    <w:lsdException w:uiPriority="0" w:name="Table List 7"/>
+    <w:lsdException w:uiPriority="0" w:name="Table List 8"/>
+    <w:lsdException w:uiPriority="0" w:name="Table 3D effects 1"/>
+    <w:lsdException w:uiPriority="0" w:name="Table 3D effects 2"/>
+    <w:lsdException w:uiPriority="0" w:name="Table 3D effects 3"/>
+    <w:lsdException w:uiPriority="0" w:name="Table Contemporary"/>
+    <w:lsdException w:uiPriority="0" w:name="Table Elegant"/>
+    <w:lsdException w:uiPriority="0" w:name="Table Professional"/>
+    <w:lsdException w:uiPriority="0" w:name="Table Subtle 1"/>
+    <w:lsdException w:uiPriority="0" w:name="Table Subtle 2"/>
+    <w:lsdException w:uiPriority="0" w:name="Table Web 1"/>
+    <w:lsdException w:uiPriority="0" w:name="Table Web 2"/>
+    <w:lsdException w:uiPriority="0" w:name="Table Web 3"/>
+    <w:lsdException w:unhideWhenUsed="0" w:uiPriority="0" w:semiHidden="0" w:name="Balloon Text"/>
+    <w:lsdException w:unhideWhenUsed="0" w:uiPriority="0" w:semiHidden="0" w:name="Table Grid"/>
+    <w:lsdException w:uiPriority="0" w:name="Table Theme"/>
+    <w:lsdException w:unhideWhenUsed="0" w:uiPriority="60" w:semiHidden="0" w:name="Light Shading"/>
+    <w:lsdException w:unhideWhenUsed="0" w:uiPriority="61" w:semiHidden="0" w:name="Light List"/>
+    <w:lsdException w:unhideWhenUsed="0" w:uiPriority="62" w:semiHidden="0" w:name="Light Grid"/>
+    <w:lsdException w:unhideWhenUsed="0" w:uiPriority="63" w:semiHidden="0" w:name="Medium Shading 1"/>
+    <w:lsdException w:unhideWhenUsed="0" w:uiPriority="64" w:semiHidden="0" w:name="Medium Shading 2"/>
+    <w:lsdException w:unhideWhenUsed="0" w:uiPriority="65" w:semiHidden="0" w:name="Medium List 1"/>
+    <w:lsdException w:unhideWhenUsed="0" w:uiPriority="66" w:semiHidden="0" w:name="Medium List 2"/>
+    <w:lsdException w:unhideWhenUsed="0" w:uiPriority="67" w:semiHidden="0" w:name="Medium Grid 1"/>
+    <w:lsdException w:unhideWhenUsed="0" w:uiPriority="68" w:semiHidden="0" w:name="Medium Grid 2"/>
+    <w:lsdException w:unhideWhenUsed="0" w:uiPriority="69" w:semiHidden="0" w:name="Medium Grid 3"/>
+    <w:lsdException w:unhideWhenUsed="0" w:uiPriority="70" w:semiHidden="0" w:name="Dark List"/>
+    <w:lsdException w:unhideWhenUsed="0" w:uiPriority="71" w:semiHidden="0" w:name="Colorful Shading"/>
+    <w:lsdException w:unhideWhenUsed="0" w:uiPriority="72" w:semiHidden="0" w:name="Colorful List"/>
+    <w:lsdException w:unhideWhenUsed="0" w:uiPriority="73" w:semiHidden="0" w:name="Colorful Grid"/>
+    <w:lsdException w:unhideWhenUsed="0" w:uiPriority="60" w:semiHidden="0" w:name="Light Shading Accent 1"/>
+    <w:lsdException w:unhideWhenUsed="0" w:uiPriority="61" w:semiHidden="0" w:name="Light List Accent 1"/>
+    <w:lsdException w:unhideWhenUsed="0" w:uiPriority="62" w:semiHidden="0" w:name="Light Grid Accent 1"/>
+    <w:lsdException w:unhideWhenUsed="0" w:uiPriority="63" w:semiHidden="0" w:name="Medium Shading 1 Accent 1"/>
+    <w:lsdException w:unhideWhenUsed="0" w:uiPriority="64" w:semiHidden="0" w:name="Medium Shading 2 Accent 1"/>
+    <w:lsdException w:unhideWhenUsed="0" w:uiPriority="65" w:semiHidden="0" w:name="Medium List 1 Accent 1"/>
+    <w:lsdException w:unhideWhenUsed="0" w:uiPriority="66" w:semiHidden="0" w:name="Medium List 2 Accent 1"/>
+    <w:lsdException w:unhideWhenUsed="0" w:uiPriority="67" w:semiHidden="0" w:name="Medium Grid 1 Accent 1"/>
+    <w:lsdException w:unhideWhenUsed="0" w:uiPriority="68" w:semiHidden="0" w:name="Medium Grid 2 Accent 1"/>
+    <w:lsdException w:unhideWhenUsed="0" w:uiPriority="69" w:semiHidden="0" w:name="Medium Grid 3 Accent 1"/>
+    <w:lsdException w:unhideWhenUsed="0" w:uiPriority="70" w:semiHidden="0" w:name="Dark List Accent 1"/>
+    <w:lsdException w:unhideWhenUsed="0" w:uiPriority="71" w:semiHidden="0" w:name="Colorful Shading Accent 1"/>
+    <w:lsdException w:unhideWhenUsed="0" w:uiPriority="72" w:semiHidden="0" w:name="Colorful List Accent 1"/>
+    <w:lsdException w:unhideWhenUsed="0" w:uiPriority="73" w:semiHidden="0" w:name="Colorful Grid Accent 1"/>
+    <w:lsdException w:unhideWhenUsed="0" w:uiPriority="60" w:semiHidden="0" w:name="Light Shading Accent 2"/>
+    <w:lsdException w:unhideWhenUsed="0" w:uiPriority="61" w:semiHidden="0" w:name="Light List Accent 2"/>
+    <w:lsdException w:unhideWhenUsed="0" w:uiPriority="62" w:semiHidden="0" w:name="Light Grid Accent 2"/>
+    <w:lsdException w:unhideWhenUsed="0" w:uiPriority="63" w:semiHidden="0" w:name="Medium Shading 1 Accent 2"/>
+    <w:lsdException w:unhideWhenUsed="0" w:uiPriority="64" w:semiHidden="0" w:name="Medium Shading 2 Accent 2"/>
+    <w:lsdException w:unhideWhenUsed="0" w:uiPriority="65" w:semiHidden="0" w:name="Medium List 1 Accent 2"/>
+    <w:lsdException w:unhideWhenUsed="0" w:uiPriority="66" w:semiHidden="0" w:name="Medium List 2 Accent 2"/>
+    <w:lsdException w:unhideWhenUsed="0" w:uiPriority="67" w:semiHidden="0" w:name="Medium Grid 1 Accent 2"/>
+    <w:lsdException w:unhideWhenUsed="0" w:uiPriority="68" w:semiHidden="0" w:name="Medium Grid 2 Accent 2"/>
+    <w:lsdException w:unhideWhenUsed="0" w:uiPriority="69" w:semiHidden="0" w:name="Medium Grid 3 Accent 2"/>
+    <w:lsdException w:unhideWhenUsed="0" w:uiPriority="70" w:semiHidden="0" w:name="Dark List Accent 2"/>
+    <w:lsdException w:unhideWhenUsed="0" w:uiPriority="71" w:semiHidden="0" w:name="Colorful Shading Accent 2"/>
+    <w:lsdException w:unhideWhenUsed="0" w:uiPriority="72" w:semiHidden="0" w:name="Colorful List Accent 2"/>
+    <w:lsdException w:unhideWhenUsed="0" w:uiPriority="73" w:semiHidden="0" w:name="Colorful Grid Accent 2"/>
+    <w:lsdException w:unhideWhenUsed="0" w:uiPriority="60" w:semiHidden="0" w:name="Light Shading Accent 3"/>
+    <w:lsdException w:unhideWhenUsed="0" w:uiPriority="61" w:semiHidden="0" w:name="Light List Accent 3"/>
+    <w:lsdException w:unhideWhenUsed="0" w:uiPriority="62" w:semiHidden="0" w:name="Light Grid Accent 3"/>
+    <w:lsdException w:unhideWhenUsed="0" w:uiPriority="63" w:semiHidden="0" w:name="Medium Shading 1 Accent 3"/>
+    <w:lsdException w:unhideWhenUsed="0" w:uiPriority="64" w:semiHidden="0" w:name="Medium Shading 2 Accent 3"/>
+    <w:lsdException w:unhideWhenUsed="0" w:uiPriority="65" w:semiHidden="0" w:name="Medium List 1 Accent 3"/>
+    <w:lsdException w:unhideWhenUsed="0" w:uiPriority="66" w:semiHidden="0" w:name="Medium List 2 Accent 3"/>
+    <w:lsdException w:unhideWhenUsed="0" w:uiPriority="67" w:semiHidden="0" w:name="Medium Grid 1 Accent 3"/>
+    <w:lsdException w:unhideWhenUsed="0" w:uiPriority="68" w:semiHidden="0" w:name="Medium Grid 2 Accent 3"/>
+    <w:lsdException w:unhideWhenUsed="0" w:uiPriority="69" w:semiHidden="0" w:name="Medium Grid 3 Accent 3"/>
+    <w:lsdException w:unhideWhenUsed="0" w:uiPriority="70" w:semiHidden="0" w:name="Dark List Accent 3"/>
+    <w:lsdException w:unhideWhenUsed="0" w:uiPriority="71" w:semiHidden="0" w:name="Colorful Shading Accent 3"/>
+    <w:lsdException w:unhideWhenUsed="0" w:uiPriority="72" w:semiHidden="0" w:name="Colorful List Accent 3"/>
+    <w:lsdException w:unhideWhenUsed="0" w:uiPriority="73" w:semiHidden="0" w:name="Colorful Grid Accent 3"/>
+    <w:lsdException w:unhideWhenUsed="0" w:uiPriority="60" w:semiHidden="0" w:name="Light Shading Accent 4"/>
+    <w:lsdException w:unhideWhenUsed="0" w:uiPriority="61" w:semiHidden="0" w:name="Light List Accent 4"/>
+    <w:lsdException w:unhideWhenUsed="0" w:uiPriority="62" w:semiHidden="0" w:name="Light Grid Accent 4"/>
+    <w:lsdException w:unhideWhenUsed="0" w:uiPriority="63" w:semiHidden="0" w:name="Medium Shading 1 Accent 4"/>
+    <w:lsdException w:unhideWhenUsed="0" w:uiPriority="64" w:semiHidden="0" w:name="Medium Shading 2 Accent 4"/>
+    <w:lsdException w:unhideWhenUsed="0" w:uiPriority="65" w:semiHidden="0" w:name="Medium List 1 Accent 4"/>
+    <w:lsdException w:unhideWhenUsed="0" w:uiPriority="66" w:semiHidden="0" w:name="Medium List 2 Accent 4"/>
+    <w:lsdException w:unhideWhenUsed="0" w:uiPriority="67" w:semiHidden="0" w:name="Medium Grid 1 Accent 4"/>
+    <w:lsdException w:unhideWhenUsed="0" w:uiPriority="68" w:semiHidden="0" w:name="Medium Grid 2 Accent 4"/>
+    <w:lsdException w:unhideWhenUsed="0" w:uiPriority="69" w:semiHidden="0" w:name="Medium Grid 3 Accent 4"/>
+    <w:lsdException w:unhideWhenUsed="0" w:uiPriority="70" w:semiHidden="0" w:name="Dark List Accent 4"/>
+    <w:lsdException w:unhideWhenUsed="0" w:uiPriority="71" w:semiHidden="0" w:name="Colorful Shading Accent 4"/>
+    <w:lsdException w:unhideWhenUsed="0" w:uiPriority="72" w:semiHidden="0" w:name="Colorful List Accent 4"/>
+    <w:lsdException w:unhideWhenUsed="0" w:uiPriority="73" w:semiHidden="0" w:name="Colorful Grid Accent 4"/>
+    <w:lsdException w:unhideWhenUsed="0" w:uiPriority="60" w:semiHidden="0" w:name="Light Shading Accent 5"/>
+    <w:lsdException w:unhideWhenUsed="0" w:uiPriority="61" w:semiHidden="0" w:name="Light List Accent 5"/>
+    <w:lsdException w:unhideWhenUsed="0" w:uiPriority="62" w:semiHidden="0" w:name="Light Grid Accent 5"/>
+    <w:lsdException w:unhideWhenUsed="0" w:uiPriority="63" w:semiHidden="0" w:name="Medium Shading 1 Accent 5"/>
+    <w:lsdException w:unhideWhenUsed="0" w:uiPriority="64" w:semiHidden="0" w:name="Medium Shading 2 Accent 5"/>
+    <w:lsdException w:unhideWhenUsed="0" w:uiPriority="65" w:semiHidden="0" w:name="Medium List 1 Accent 5"/>
+    <w:lsdException w:unhideWhenUsed="0" w:uiPriority="66" w:semiHidden="0" w:name="Medium List 2 Accent 5"/>
+    <w:lsdException w:unhideWhenUsed="0" w:uiPriority="67" w:semiHidden="0" w:name="Medium Grid 1 Accent 5"/>
+    <w:lsdException w:unhideWhenUsed="0" w:uiPriority="68" w:semiHidden="0" w:name="Medium Grid 2 Accent 5"/>
+    <w:lsdException w:unhideWhenUsed="0" w:uiPriority="69" w:semiHidden="0" w:name="Medium Grid 3 Accent 5"/>
+    <w:lsdException w:unhideWhenUsed="0" w:uiPriority="70" w:semiHidden="0" w:name="Dark List Accent 5"/>
+    <w:lsdException w:unhideWhenUsed="0" w:uiPriority="71" w:semiHidden="0" w:name="Colorful Shading Accent 5"/>
+    <w:lsdException w:unhideWhenUsed="0" w:uiPriority="72" w:semiHidden="0" w:name="Colorful List Accent 5"/>
+    <w:lsdException w:unhideWhenUsed="0" w:uiPriority="73" w:semiHidden="0" w:name="Colorful Grid Accent 5"/>
+    <w:lsdException w:unhideWhenUsed="0" w:uiPriority="60" w:semiHidden="0" w:name="Light Shading Accent 6"/>
+    <w:lsdException w:unhideWhenUsed="0" w:uiPriority="61" w:semiHidden="0" w:name="Light List Accent 6"/>
+    <w:lsdException w:unhideWhenUsed="0" w:uiPriority="62" w:semiHidden="0" w:name="Light Grid Accent 6"/>
+    <w:lsdException w:unhideWhenUsed="0" w:uiPriority="63" w:semiHidden="0" w:name="Medium Shading 1 Accent 6"/>
+    <w:lsdException w:unhideWhenUsed="0" w:uiPriority="64" w:semiHidden="0" w:name="Medium Shading 2 Accent 6"/>
+    <w:lsdException w:unhideWhenUsed="0" w:uiPriority="65" w:semiHidden="0" w:name="Medium List 1 Accent 6"/>
+    <w:lsdException w:unhideWhenUsed="0" w:uiPriority="66" w:semiHidden="0" w:name="Medium List 2 Accent 6"/>
+    <w:lsdException w:unhideWhenUsed="0" w:uiPriority="67" w:semiHidden="0" w:name="Medium Grid 1 Accent 6"/>
+    <w:lsdException w:unhideWhenUsed="0" w:uiPriority="68" w:semiHidden="0" w:name="Medium Grid 2 Accent 6"/>
+    <w:lsdException w:unhideWhenUsed="0" w:uiPriority="69" w:semiHidden="0" w:name="Medium Grid 3 Accent 6"/>
+    <w:lsdException w:unhideWhenUsed="0" w:uiPriority="70" w:semiHidden="0" w:name="Dark List Accent 6"/>
+    <w:lsdException w:unhideWhenUsed="0" w:uiPriority="71" w:semiHidden="0" w:name="Colorful Shading Accent 6"/>
+    <w:lsdException w:unhideWhenUsed="0" w:uiPriority="72" w:semiHidden="0" w:name="Colorful List Accent 6"/>
+    <w:lsdException w:unhideWhenUsed="0" w:uiPriority="73" w:semiHidden="0" w:name="Colorful Grid Accent 6"/>
   </w:latentStyles>
-  <w:style w:type="paragraph" w:styleId="000004">
+  <w:style w:type="paragraph" w:default="1" w:styleId="1">
+    <w:name w:val="Normal"/>
+    <w:qFormat/>
+    <w:uiPriority w:val="0"/>
+    <w:pPr>
+      <w:widowControl w:val="0"/>
+      <w:spacing w:before="60" w:after="60"/>
+      <w:jc w:val="both"/>
+    </w:pPr>
+    <w:rPr>
+      <w:rFonts w:ascii="Arial" w:hAnsi="Arial" w:eastAsia="微软雅黑" w:cs="Arial"/>
+      <w:color w:val="333333"/>
+      <w:kern w:val="2"/>
+      <w:sz w:val="22"/>
+      <w:szCs w:val="24"/>
+      <w:lang w:val="en-US" w:eastAsia="zh-CN" w:bidi="ar-SA"/>
+    </w:rPr>
+  </w:style>
+  <w:style w:type="paragraph" w:styleId="2">
+    <w:name w:val="heading 1"/>
+    <w:basedOn w:val="1"/>
+    <w:next w:val="1"/>
+    <w:qFormat/>
+    <w:uiPriority w:val="0"/>
+    <w:pPr>
+      <w:keepNext/>
+      <w:keepLines/>
+      <w:outlineLvl w:val="0"/>
+    </w:pPr>
+    <w:rPr>
+      <w:b/>
+      <w:kern w:val="44"/>
+      <w:sz w:val="36"/>
+    </w:rPr>
+  </w:style>
+  <w:style w:type="paragraph" w:styleId="3">
+    <w:name w:val="heading 2"/>
+    <w:basedOn w:val="1"/>
+    <w:next w:val="1"/>
+    <w:qFormat/>
+    <w:uiPriority w:val="0"/>
+    <w:pPr>
+      <w:keepNext/>
+      <w:keepLines/>
+      <w:outlineLvl w:val="1"/>
+    </w:pPr>
+    <w:rPr>
+      <w:b/>
+      <w:sz w:val="32"/>
+    </w:rPr>
+  </w:style>
+  <w:style w:type="paragraph" w:styleId="4">
     <w:name w:val="heading 3"/>
-    <w:basedOn w:val="000001"/>
-    <w:next w:val="000001"/>
-    <w:qFormat w:val="1"/>
+    <w:basedOn w:val="1"/>
+    <w:next w:val="1"/>
+    <w:qFormat/>
+    <w:uiPriority w:val="0"/>
     <w:pPr>
-      <w:keepNext w:val="1"/>
-      <w:keepLines w:val="1"/>
+      <w:keepNext/>
+      <w:keepLines/>
       <w:outlineLvl w:val="2"/>
     </w:pPr>
     <w:rPr>
-      <w:b w:val="1"/>
+      <w:b/>
       <w:sz w:val="28"/>
     </w:rPr>
   </w:style>
-  <w:style w:type="character" w:styleId="00000b" w:default="1">
+  <w:style w:type="paragraph" w:styleId="5">
+    <w:name w:val="heading 4"/>
+    <w:basedOn w:val="1"/>
+    <w:next w:val="1"/>
+    <w:qFormat/>
+    <w:uiPriority w:val="0"/>
+    <w:pPr>
+      <w:keepNext/>
+      <w:keepLines/>
+      <w:outlineLvl w:val="3"/>
+    </w:pPr>
+    <w:rPr>
+      <w:b/>
+      <w:sz w:val="24"/>
+    </w:rPr>
+  </w:style>
+  <w:style w:type="paragraph" w:styleId="6">
+    <w:name w:val="heading 5"/>
+    <w:basedOn w:val="1"/>
+    <w:next w:val="1"/>
+    <w:qFormat/>
+    <w:uiPriority w:val="0"/>
+    <w:pPr>
+      <w:keepNext/>
+      <w:keepLines/>
+      <w:spacing w:line="480" w:lineRule="auto"/>
+      <w:outlineLvl w:val="4"/>
+    </w:pPr>
+    <w:rPr>
+      <w:b/>
+    </w:rPr>
+  </w:style>
+  <w:style w:type="paragraph" w:styleId="7">
+    <w:name w:val="heading 6"/>
+    <w:basedOn w:val="1"/>
+    <w:next w:val="1"/>
+    <w:qFormat/>
+    <w:uiPriority w:val="0"/>
+    <w:pPr>
+      <w:keepNext/>
+      <w:keepLines/>
+      <w:spacing w:line="480" w:lineRule="auto"/>
+      <w:outlineLvl w:val="5"/>
+    </w:pPr>
+    <w:rPr>
+      <w:b/>
+    </w:rPr>
+  </w:style>
+  <w:style w:type="paragraph" w:styleId="8">
+    <w:name w:val="heading 7"/>
+    <w:basedOn w:val="1"/>
+    <w:next w:val="1"/>
+    <w:unhideWhenUsed/>
+    <w:qFormat/>
+    <w:uiPriority w:val="0"/>
+    <w:pPr>
+      <w:keepNext/>
+      <w:keepLines/>
+      <w:spacing w:line="480" w:lineRule="auto"/>
+      <w:outlineLvl w:val="6"/>
+    </w:pPr>
+    <w:rPr>
+      <w:b/>
+    </w:rPr>
+  </w:style>
+  <w:style w:type="paragraph" w:styleId="9">
+    <w:name w:val="heading 8"/>
+    <w:basedOn w:val="1"/>
+    <w:next w:val="1"/>
+    <w:unhideWhenUsed/>
+    <w:qFormat/>
+    <w:uiPriority w:val="0"/>
+    <w:pPr>
+      <w:keepNext/>
+      <w:keepLines/>
+      <w:spacing w:line="480" w:lineRule="auto"/>
+      <w:outlineLvl w:val="7"/>
+    </w:pPr>
+    <w:rPr>
+      <w:b/>
+    </w:rPr>
+  </w:style>
+  <w:style w:type="paragraph" w:styleId="10">
+    <w:name w:val="heading 9"/>
+    <w:basedOn w:val="1"/>
+    <w:next w:val="1"/>
+    <w:unhideWhenUsed/>
+    <w:qFormat/>
+    <w:uiPriority w:val="0"/>
+    <w:pPr>
+      <w:keepNext/>
+      <w:keepLines/>
+      <w:spacing w:line="480" w:lineRule="auto"/>
+      <w:outlineLvl w:val="8"/>
+    </w:pPr>
+    <w:rPr>
+      <w:b/>
+    </w:rPr>
+  </w:style>
+  <w:style w:type="character" w:default="1" w:styleId="18">
     <w:name w:val="Default Paragraph Font"/>
+    <w:semiHidden/>
+    <w:unhideWhenUsed/>
     <w:uiPriority w:val="1"/>
-    <w:semiHidden w:val="1"/>
-    <w:unhideWhenUsed w:val="1"/>
   </w:style>
-  <w:style w:type="paragraph" w:styleId="000010">
+  <w:style w:type="table" w:default="1" w:styleId="16">
+    <w:name w:val="Normal Table"/>
+    <w:semiHidden/>
+    <w:unhideWhenUsed/>
+    <w:uiPriority w:val="99"/>
+    <w:tblPr>
+      <w:tblCellMar>
+        <w:top w:w="0" w:type="dxa"/>
+        <w:left w:w="108" w:type="dxa"/>
+        <w:bottom w:w="0" w:type="dxa"/>
+        <w:right w:w="108" w:type="dxa"/>
+      </w:tblCellMar>
+    </w:tblPr>
+  </w:style>
+  <w:style w:type="paragraph" w:styleId="11">
+    <w:name w:val="toc 8"/>
+    <w:basedOn w:val="1"/>
+    <w:next w:val="1"/>
+    <w:autoRedefine/>
+    <w:uiPriority w:val="99"/>
+    <w:pPr>
+      <w:ind w:left="2940" w:leftChars="1400"/>
+    </w:pPr>
+  </w:style>
+  <w:style w:type="paragraph" w:styleId="12">
+    <w:name w:val="footer"/>
+    <w:basedOn w:val="1"/>
+    <w:uiPriority w:val="0"/>
+    <w:pPr>
+      <w:tabs>
+        <w:tab w:val="center" w:pos="4153"/>
+        <w:tab w:val="right" w:pos="8306"/>
+      </w:tabs>
+      <w:snapToGrid w:val="0"/>
+      <w:jc w:val="center"/>
+    </w:pPr>
+    <w:rPr>
+      <w:sz w:val="18"/>
+      <w:szCs w:val="18"/>
+    </w:rPr>
+  </w:style>
+  <w:style w:type="paragraph" w:styleId="13">
     <w:name w:val="header"/>
-    <w:basedOn w:val="000001"/>
+    <w:basedOn w:val="1"/>
+    <w:uiPriority w:val="0"/>
     <w:pPr>
       <w:pBdr>
         <w:bottom w:val="single" w:color="auto" w:sz="6" w:space="1"/>
@@ -2667,52 +2725,49 @@
       <w:szCs w:val="18"/>
     </w:rPr>
   </w:style>
-  <w:style w:type="paragraph" w:styleId="000001" w:default="1">
-    <w:name w:val="Normal"/>
-    <w:qFormat w:val="1"/>
+  <w:style w:type="paragraph" w:styleId="14">
+    <w:name w:val="Subtitle"/>
+    <w:basedOn w:val="1"/>
+    <w:next w:val="1"/>
+    <w:link w:val="22"/>
+    <w:qFormat/>
+    <w:uiPriority w:val="0"/>
     <w:pPr>
-      <w:widowControl w:val="0"/>
-      <w:spacing w:before="60" w:after="60"/>
-      <w:jc w:val="both"/>
-    </w:pPr>
-    <w:rPr>
-      <w:color w:val="333333"/>
-      <w:kern w:val="2"/>
-      <w:sz w:val="22"/>
-      <w:szCs w:val="24"/>
-    </w:rPr>
-  </w:style>
-  <w:style w:type="paragraph" w:styleId="000003">
-    <w:name w:val="heading 2"/>
-    <w:basedOn w:val="000001"/>
-    <w:next w:val="000001"/>
-    <w:qFormat w:val="1"/>
-    <w:pPr>
-      <w:keepNext w:val="1"/>
-      <w:keepLines w:val="1"/>
+      <w:jc w:val="center"/>
       <w:outlineLvl w:val="1"/>
     </w:pPr>
     <w:rPr>
-      <w:b w:val="1"/>
-      <w:sz w:val="32"/>
+      <w:rFonts w:cstheme="minorBidi"/>
+      <w:b/>
+      <w:bCs/>
+      <w:kern w:val="28"/>
+      <w:sz w:val="44"/>
+      <w:szCs w:val="32"/>
     </w:rPr>
   </w:style>
-  <w:style w:type="paragraph" w:styleId="000018" w:customStyle="1">
-    <w:name w:val="melo-codeblock-Base-theme-para"/>
-    <w:uiPriority w:val="99"/>
+  <w:style w:type="paragraph" w:styleId="15">
+    <w:name w:val="Title"/>
+    <w:basedOn w:val="1"/>
+    <w:next w:val="1"/>
+    <w:link w:val="23"/>
+    <w:qFormat/>
+    <w:uiPriority w:val="0"/>
     <w:pPr>
-      <w:snapToGrid w:val="0"/>
-      <w:spacing w:line="360" w:lineRule="auto"/>
+      <w:jc w:val="center"/>
+      <w:outlineLvl w:val="0"/>
     </w:pPr>
     <w:rPr>
-      <w:rFonts w:ascii="Monaco" w:hAnsi="Monaco" w:eastAsia="Monaco" w:cs="Monaco"/>
-      <w:color w:val="000000"/>
-      <w:sz w:val="21"/>
+      <w:rFonts w:cstheme="majorBidi"/>
+      <w:b/>
+      <w:bCs/>
+      <w:sz w:val="48"/>
+      <w:szCs w:val="32"/>
     </w:rPr>
   </w:style>
-  <w:style w:type="table" w:styleId="000015">
+  <w:style w:type="table" w:styleId="17">
     <w:name w:val="Table Grid"/>
-    <w:basedOn w:val="00000c"/>
+    <w:basedOn w:val="16"/>
+    <w:uiPriority w:val="0"/>
     <w:tblPr>
       <w:tblBorders>
         <w:top w:val="single" w:color="CBCDD1" w:sz="6" w:space="0"/>
@@ -2727,79 +2782,30 @@
       <w:vAlign w:val="center"/>
     </w:tcPr>
   </w:style>
-  <w:style w:type="paragraph" w:styleId="000008">
-    <w:name w:val="heading 7"/>
-    <w:basedOn w:val="000001"/>
-    <w:next w:val="000001"/>
-    <w:unhideWhenUsed w:val="1"/>
-    <w:qFormat w:val="1"/>
+  <w:style w:type="character" w:styleId="19">
+    <w:name w:val="Hyperlink"/>
+    <w:basedOn w:val="18"/>
+    <w:uiPriority w:val="0"/>
+    <w:rPr>
+      <w:color w:val="1E6FFF"/>
+      <w:u w:val="single"/>
+    </w:rPr>
+  </w:style>
+  <w:style w:type="paragraph" w:customStyle="1" w:styleId="20">
+    <w:name w:val="melo-codeblock-Base-theme-para"/>
+    <w:uiPriority w:val="99"/>
     <w:pPr>
-      <w:keepNext w:val="1"/>
-      <w:keepLines w:val="1"/>
-      <w:spacing w:line="480" w:lineRule="auto"/>
-      <w:outlineLvl w:val="6"/>
+      <w:snapToGrid w:val="0"/>
+      <w:spacing w:line="360" w:lineRule="auto"/>
     </w:pPr>
     <w:rPr>
-      <w:b w:val="1"/>
+      <w:rFonts w:ascii="Monaco" w:hAnsi="Monaco" w:eastAsia="Monaco" w:cs="Monaco"/>
+      <w:color w:val="000000"/>
+      <w:sz w:val="21"/>
+      <w:lang w:val="en-US" w:eastAsia="zh-CN" w:bidi="ar-SA"/>
     </w:rPr>
   </w:style>
-  <w:style w:type="paragraph" w:styleId="000009">
-    <w:name w:val="heading 8"/>
-    <w:basedOn w:val="000001"/>
-    <w:next w:val="000001"/>
-    <w:unhideWhenUsed w:val="1"/>
-    <w:qFormat w:val="1"/>
-    <w:pPr>
-      <w:keepNext w:val="1"/>
-      <w:keepLines w:val="1"/>
-      <w:spacing w:line="480" w:lineRule="auto"/>
-      <w:outlineLvl w:val="7"/>
-    </w:pPr>
-    <w:rPr>
-      <w:b w:val="1"/>
-    </w:rPr>
-  </w:style>
-  <w:style w:type="paragraph" w:styleId="000005">
-    <w:name w:val="heading 4"/>
-    <w:basedOn w:val="000001"/>
-    <w:next w:val="000001"/>
-    <w:qFormat w:val="1"/>
-    <w:pPr>
-      <w:keepNext w:val="1"/>
-      <w:keepLines w:val="1"/>
-      <w:outlineLvl w:val="3"/>
-    </w:pPr>
-    <w:rPr>
-      <w:b w:val="1"/>
-      <w:sz w:val="24"/>
-    </w:rPr>
-  </w:style>
-  <w:style w:type="paragraph" w:styleId="000006">
-    <w:name w:val="heading 5"/>
-    <w:basedOn w:val="000001"/>
-    <w:next w:val="000001"/>
-    <w:qFormat w:val="1"/>
-    <w:pPr>
-      <w:keepNext w:val="1"/>
-      <w:keepLines w:val="1"/>
-      <w:spacing w:line="480" w:lineRule="auto"/>
-      <w:outlineLvl w:val="4"/>
-    </w:pPr>
-    <w:rPr>
-      <w:b w:val="1"/>
-    </w:rPr>
-  </w:style>
-  <w:style w:type="paragraph" w:styleId="00000e">
-    <w:name w:val="toc 8"/>
-    <w:basedOn w:val="000001"/>
-    <w:next w:val="000001"/>
-    <w:autoRedefine w:val="1"/>
-    <w:uiPriority w:val="99"/>
-    <w:pPr>
-      <w:ind w:left="2940" w:leftChars="1400"/>
-    </w:pPr>
-  </w:style>
-  <w:style w:type="character" w:styleId="000017" w:customStyle="1">
+  <w:style w:type="character" w:customStyle="1" w:styleId="21">
     <w:name w:val="melo-codeblock-Base-theme-char"/>
     <w:uiPriority w:val="99"/>
     <w:rPr>
@@ -2808,159 +2814,32 @@
       <w:sz w:val="21"/>
     </w:rPr>
   </w:style>
-  <w:style w:type="paragraph" w:styleId="000013">
-    <w:name w:val="Title"/>
-    <w:basedOn w:val="000001"/>
-    <w:next w:val="000001"/>
-    <w:link w:val="000014"/>
-    <w:qFormat w:val="1"/>
-    <w:pPr>
-      <w:jc w:val="center"/>
-      <w:outlineLvl w:val="0"/>
-    </w:pPr>
-    <w:rPr>
-      <w:rFonts w:cstheme="majorBidi"/>
-      <w:b w:val="1"/>
-      <w:bCs w:val="1"/>
-      <w:sz w:val="48"/>
-      <w:szCs w:val="32"/>
-    </w:rPr>
-  </w:style>
-  <w:style w:type="numbering" w:styleId="00000d" w:default="1">
-    <w:name w:val="No List"/>
-    <w:uiPriority w:val="99"/>
-    <w:semiHidden w:val="1"/>
-    <w:unhideWhenUsed w:val="1"/>
-  </w:style>
-  <w:style w:type="character" w:styleId="000012" w:customStyle="1">
+  <w:style w:type="character" w:customStyle="1" w:styleId="22">
     <w:name w:val="副标题 字符"/>
-    <w:basedOn w:val="00000b"/>
-    <w:link w:val="000011"/>
+    <w:basedOn w:val="18"/>
+    <w:link w:val="14"/>
+    <w:uiPriority w:val="0"/>
     <w:rPr>
       <w:rFonts w:ascii="Arial" w:hAnsi="Arial" w:eastAsia="微软雅黑" w:cstheme="minorBidi"/>
-      <w:b w:val="1"/>
-      <w:bCs w:val="1"/>
+      <w:b/>
+      <w:bCs/>
       <w:kern w:val="28"/>
       <w:sz w:val="44"/>
       <w:szCs w:val="32"/>
     </w:rPr>
   </w:style>
-  <w:style w:type="paragraph" w:styleId="00000a">
-    <w:name w:val="heading 9"/>
-    <w:basedOn w:val="000001"/>
-    <w:next w:val="000001"/>
-    <w:unhideWhenUsed w:val="1"/>
-    <w:qFormat w:val="1"/>
-    <w:pPr>
-      <w:keepNext w:val="1"/>
-      <w:keepLines w:val="1"/>
-      <w:spacing w:line="480" w:lineRule="auto"/>
-      <w:outlineLvl w:val="8"/>
-    </w:pPr>
-    <w:rPr>
-      <w:b w:val="1"/>
-    </w:rPr>
-  </w:style>
-  <w:style w:type="paragraph" w:styleId="000002">
-    <w:name w:val="heading 1"/>
-    <w:basedOn w:val="000001"/>
-    <w:next w:val="000001"/>
-    <w:qFormat w:val="1"/>
-    <w:pPr>
-      <w:keepNext w:val="1"/>
-      <w:keepLines w:val="1"/>
-      <w:outlineLvl w:val="0"/>
-    </w:pPr>
-    <w:rPr>
-      <w:b w:val="1"/>
-      <w:kern w:val="44"/>
-      <w:sz w:val="36"/>
-    </w:rPr>
-  </w:style>
-  <w:style w:type="paragraph" w:styleId="000011">
-    <w:name w:val="Subtitle"/>
-    <w:basedOn w:val="000001"/>
-    <w:next w:val="000001"/>
-    <w:link w:val="000012"/>
-    <w:qFormat w:val="1"/>
-    <w:pPr>
-      <w:jc w:val="center"/>
-      <w:outlineLvl w:val="1"/>
-    </w:pPr>
-    <w:rPr>
-      <w:rFonts w:cstheme="minorBidi"/>
-      <w:b w:val="1"/>
-      <w:bCs w:val="1"/>
-      <w:kern w:val="28"/>
-      <w:sz w:val="44"/>
-      <w:szCs w:val="32"/>
-    </w:rPr>
-  </w:style>
-  <w:style w:type="paragraph" w:styleId="000007">
-    <w:name w:val="heading 6"/>
-    <w:basedOn w:val="000001"/>
-    <w:next w:val="000001"/>
-    <w:qFormat w:val="1"/>
-    <w:pPr>
-      <w:keepNext w:val="1"/>
-      <w:keepLines w:val="1"/>
-      <w:spacing w:line="480" w:lineRule="auto"/>
-      <w:outlineLvl w:val="5"/>
-    </w:pPr>
-    <w:rPr>
-      <w:b w:val="1"/>
-    </w:rPr>
-  </w:style>
-  <w:style w:type="character" w:styleId="000014" w:customStyle="1">
+  <w:style w:type="character" w:customStyle="1" w:styleId="23">
     <w:name w:val="标题 字符"/>
-    <w:basedOn w:val="00000b"/>
-    <w:link w:val="000013"/>
+    <w:basedOn w:val="18"/>
+    <w:link w:val="15"/>
+    <w:uiPriority w:val="0"/>
     <w:rPr>
       <w:rFonts w:ascii="Arial" w:hAnsi="Arial" w:eastAsia="微软雅黑" w:cstheme="majorBidi"/>
-      <w:b w:val="1"/>
-      <w:bCs w:val="1"/>
+      <w:b/>
+      <w:bCs/>
       <w:kern w:val="2"/>
       <w:sz w:val="48"/>
       <w:szCs w:val="32"/>
-    </w:rPr>
-  </w:style>
-  <w:style w:type="table" w:styleId="00000c" w:default="1">
-    <w:name w:val="Normal Table"/>
-    <w:uiPriority w:val="99"/>
-    <w:semiHidden w:val="1"/>
-    <w:unhideWhenUsed w:val="1"/>
-    <w:tblPr>
-      <w:tblInd w:w="0" w:type="dxa"/>
-      <w:tblCellMar>
-        <w:top w:w="0" w:type="dxa"/>
-        <w:left w:w="108" w:type="dxa"/>
-        <w:bottom w:w="0" w:type="dxa"/>
-        <w:right w:w="108" w:type="dxa"/>
-      </w:tblCellMar>
-    </w:tblPr>
-  </w:style>
-  <w:style w:type="paragraph" w:styleId="00000f">
-    <w:name w:val="footer"/>
-    <w:basedOn w:val="000001"/>
-    <w:pPr>
-      <w:tabs>
-        <w:tab w:val="center" w:pos="4153"/>
-        <w:tab w:val="right" w:pos="8306"/>
-      </w:tabs>
-      <w:snapToGrid w:val="0"/>
-      <w:jc w:val="center"/>
-    </w:pPr>
-    <w:rPr>
-      <w:sz w:val="18"/>
-      <w:szCs w:val="18"/>
-    </w:rPr>
-  </w:style>
-  <w:style w:type="character" w:styleId="000016">
-    <w:name w:val="Hyperlink"/>
-    <w:basedOn w:val="00000b"/>
-    <w:rPr>
-      <w:color w:val="1E6FFF"/>
-      <w:u w:val="single"/>
     </w:rPr>
   </w:style>
 </w:styles>
@@ -3218,6 +3097,5 @@
     </a:fmtScheme>
   </a:themeElements>
   <a:objectDefaults/>
-  <a:extraClrSchemeLst/>
 </a:theme>
 </file>
</xml_diff>